<commit_message>
Clarify copyright notice layout
Structured owner, affiliation, and personal-use restriction
on GitHub description, README, COPYRIGHT.md, app footer, and Word cover.
</commit_message>
<xml_diff>
--- a/public/docs/laksi-500-intersection-oa.docx
+++ b/public/docs/laksi-500-intersection-oa.docx
@@ -213,7 +213,7 @@
                 <w:color w:val="1F3348"/>
                 <w:sz w:val="26"/>
               </w:rPr>
-              <w:t>วันสำรวจ</w:t>
+              <w:t>ผู้จัดทำ / ลิขสิทธิ์</w:t>
             </w:r>
           </w:p>
         </w:tc>
@@ -242,7 +242,7 @@
                 <w:color w:val="1F3348"/>
                 <w:sz w:val="26"/>
               </w:rPr>
-              <w:t>20 พฤษภาคม 2569 (วันพุธ)  อากาศปกติ</w:t>
+              <w:t>PRAPAWADEE WACHIRAPUT  © Prapawadee_W.</w:t>
             </w:r>
           </w:p>
         </w:tc>
@@ -273,7 +273,7 @@
                 <w:color w:val="1F3348"/>
                 <w:sz w:val="26"/>
               </w:rPr>
-              <w:t>พิกัด</w:t>
+              <w:t>สังกัด</w:t>
             </w:r>
           </w:p>
         </w:tc>
@@ -302,7 +302,7 @@
                 <w:color w:val="1F3348"/>
                 <w:sz w:val="26"/>
               </w:rPr>
-              <w:t>13.884608°N  100.580908°E</w:t>
+              <w:t>นักวิชาการสถิติชำนาญการ  กลุ่มงานสถิติและวิจัย</w:t>
             </w:r>
           </w:p>
         </w:tc>
@@ -333,7 +333,7 @@
                 <w:color w:val="1F3348"/>
                 <w:sz w:val="26"/>
               </w:rPr>
-              <w:t>บันทึกต้นเรื่อง</w:t>
+              <w:t>กอง / สำนัก</w:t>
             </w:r>
           </w:p>
         </w:tc>
@@ -362,7 +362,7 @@
                 <w:color w:val="1F3348"/>
                 <w:sz w:val="26"/>
               </w:rPr>
-              <w:t>กท ๗๘๑๑/๓๙๗๗  ลงวันที่ 10 สิงหาคม 2569</w:t>
+              <w:t>กองนโยบายและแผนงาน  สำนักการจราจรและขนส่ง กรุงเทพมหานคร</w:t>
             </w:r>
           </w:p>
         </w:tc>
@@ -393,7 +393,7 @@
                 <w:color w:val="1F3348"/>
                 <w:sz w:val="26"/>
               </w:rPr>
-              <w:t>จาก / ถึง</w:t>
+              <w:t>วันสำรวจ</w:t>
             </w:r>
           </w:p>
         </w:tc>
@@ -422,7 +422,7 @@
                 <w:color w:val="1F3348"/>
                 <w:sz w:val="26"/>
               </w:rPr>
-              <w:t>นายอัมรินทร์ จารุตามระ ผู้ำนวยการเขตหลักสี่  →  ผู้อำนวยการสำนักการจราจรและขนส่ง</w:t>
+              <w:t>20 พฤษภาคม 2569 (วันพุธ)  อากาศปกติ</w:t>
             </w:r>
           </w:p>
         </w:tc>
@@ -453,7 +453,7 @@
                 <w:color w:val="1F3348"/>
                 <w:sz w:val="26"/>
               </w:rPr>
-              <w:t>รับเรื่อง สจส.</w:t>
+              <w:t>พิกัด</w:t>
             </w:r>
           </w:p>
         </w:tc>
@@ -482,7 +482,7 @@
                 <w:color w:val="1F3348"/>
                 <w:sz w:val="26"/>
               </w:rPr>
-              <w:t>ช.1088/69  11 สิงหาคม 2569  ·  กลุ่มงานสถิติและวิจัย เลขรับ 446 วันที่ 13 ส.ค. 2569</w:t>
+              <w:t>13.884608°N  100.580908°E</w:t>
             </w:r>
           </w:p>
         </w:tc>
@@ -513,7 +513,7 @@
                 <w:color w:val="1F3348"/>
                 <w:sz w:val="26"/>
               </w:rPr>
-              <w:t>แหล่งข้อมูลดิบ</w:t>
+              <w:t>บันทึกต้นเรื่อง</w:t>
             </w:r>
           </w:p>
         </w:tc>
@@ -542,7 +542,7 @@
                 <w:color w:val="1F3348"/>
                 <w:sz w:val="26"/>
               </w:rPr>
-              <w:t>หลักสี่(500) 69_05_20.xlsx  (แผ่น Header, volume, Queue, Report, Analysis)</w:t>
+              <w:t>กท ๗๘๑๑/๓๙๗๗  ลงวันที่ 10 สิงหาคม 2569</w:t>
             </w:r>
           </w:p>
         </w:tc>
@@ -573,6 +573,186 @@
                 <w:color w:val="1F3348"/>
                 <w:sz w:val="26"/>
               </w:rPr>
+              <w:t>จาก / ถึง</w:t>
+            </w:r>
+          </w:p>
+        </w:tc>
+        <w:tc>
+          <w:tcPr>
+            <w:tcW w:type="dxa" w:w="4819"/>
+            <w:tcBorders>
+              <w:top w:val="single" w:sz="4" w:color="C4BBA8"/>
+              <w:left w:val="single" w:sz="4" w:color="C4BBA8"/>
+              <w:bottom w:val="single" w:sz="4" w:color="C4BBA8"/>
+              <w:right w:val="single" w:sz="4" w:color="C4BBA8"/>
+            </w:tcBorders>
+            <w:shd w:fill="FBFAf6" w:val="clear"/>
+          </w:tcPr>
+          <w:p>
+            <w:pPr>
+              <w:spacing w:before="40" w:after="40"/>
+              <w:jc w:val="center"/>
+            </w:pPr>
+            <w:r/>
+            <w:r>
+              <w:rPr>
+                <w:rFonts w:ascii="Calibri" w:hAnsi="Calibri" w:eastAsia="TH Sarabun New" w:cs="TH Sarabun New"/>
+                <w:b w:val="0"/>
+                <w:i w:val="0"/>
+                <w:color w:val="1F3348"/>
+                <w:sz w:val="26"/>
+              </w:rPr>
+              <w:t>นายอัมรินทร์ จารุตามระ ผู้ำนวยการเขตหลักสี่  →  ผู้อำนวยการสำนักการจราจรและขนส่ง</w:t>
+            </w:r>
+          </w:p>
+        </w:tc>
+      </w:tr>
+      <w:tr>
+        <w:tc>
+          <w:tcPr>
+            <w:tcW w:type="dxa" w:w="4819"/>
+            <w:tcBorders>
+              <w:top w:val="single" w:sz="4" w:color="C4BBA8"/>
+              <w:left w:val="single" w:sz="4" w:color="C4BBA8"/>
+              <w:bottom w:val="single" w:sz="4" w:color="C4BBA8"/>
+              <w:right w:val="single" w:sz="4" w:color="C4BBA8"/>
+            </w:tcBorders>
+            <w:shd w:fill="ECE7DB" w:val="clear"/>
+          </w:tcPr>
+          <w:p>
+            <w:pPr>
+              <w:spacing w:before="40" w:after="40"/>
+              <w:jc w:val="left"/>
+            </w:pPr>
+            <w:r/>
+            <w:r>
+              <w:rPr>
+                <w:rFonts w:ascii="Calibri" w:hAnsi="Calibri" w:eastAsia="TH Sarabun New" w:cs="TH Sarabun New"/>
+                <w:b w:val="0"/>
+                <w:i w:val="0"/>
+                <w:color w:val="1F3348"/>
+                <w:sz w:val="26"/>
+              </w:rPr>
+              <w:t>รับเรื่อง สจส.</w:t>
+            </w:r>
+          </w:p>
+        </w:tc>
+        <w:tc>
+          <w:tcPr>
+            <w:tcW w:type="dxa" w:w="4819"/>
+            <w:tcBorders>
+              <w:top w:val="single" w:sz="4" w:color="C4BBA8"/>
+              <w:left w:val="single" w:sz="4" w:color="C4BBA8"/>
+              <w:bottom w:val="single" w:sz="4" w:color="C4BBA8"/>
+              <w:right w:val="single" w:sz="4" w:color="C4BBA8"/>
+            </w:tcBorders>
+            <w:shd w:fill="ECE7DB" w:val="clear"/>
+          </w:tcPr>
+          <w:p>
+            <w:pPr>
+              <w:spacing w:before="40" w:after="40"/>
+              <w:jc w:val="center"/>
+            </w:pPr>
+            <w:r/>
+            <w:r>
+              <w:rPr>
+                <w:rFonts w:ascii="Calibri" w:hAnsi="Calibri" w:eastAsia="TH Sarabun New" w:cs="TH Sarabun New"/>
+                <w:b w:val="0"/>
+                <w:i w:val="0"/>
+                <w:color w:val="1F3348"/>
+                <w:sz w:val="26"/>
+              </w:rPr>
+              <w:t>ช.1088/69  11 สิงหาคม 2569  ·  กลุ่มงานสถิติและวิจัย เลขรับ 446 วันที่ 13 ส.ค. 2569</w:t>
+            </w:r>
+          </w:p>
+        </w:tc>
+      </w:tr>
+      <w:tr>
+        <w:tc>
+          <w:tcPr>
+            <w:tcW w:type="dxa" w:w="4819"/>
+            <w:tcBorders>
+              <w:top w:val="single" w:sz="4" w:color="C4BBA8"/>
+              <w:left w:val="single" w:sz="4" w:color="C4BBA8"/>
+              <w:bottom w:val="single" w:sz="4" w:color="C4BBA8"/>
+              <w:right w:val="single" w:sz="4" w:color="C4BBA8"/>
+            </w:tcBorders>
+            <w:shd w:fill="FBFAf6" w:val="clear"/>
+          </w:tcPr>
+          <w:p>
+            <w:pPr>
+              <w:spacing w:before="40" w:after="40"/>
+              <w:jc w:val="left"/>
+            </w:pPr>
+            <w:r/>
+            <w:r>
+              <w:rPr>
+                <w:rFonts w:ascii="Calibri" w:hAnsi="Calibri" w:eastAsia="TH Sarabun New" w:cs="TH Sarabun New"/>
+                <w:b w:val="0"/>
+                <w:i w:val="0"/>
+                <w:color w:val="1F3348"/>
+                <w:sz w:val="26"/>
+              </w:rPr>
+              <w:t>แหล่งข้อมูลดิบ</w:t>
+            </w:r>
+          </w:p>
+        </w:tc>
+        <w:tc>
+          <w:tcPr>
+            <w:tcW w:type="dxa" w:w="4819"/>
+            <w:tcBorders>
+              <w:top w:val="single" w:sz="4" w:color="C4BBA8"/>
+              <w:left w:val="single" w:sz="4" w:color="C4BBA8"/>
+              <w:bottom w:val="single" w:sz="4" w:color="C4BBA8"/>
+              <w:right w:val="single" w:sz="4" w:color="C4BBA8"/>
+            </w:tcBorders>
+            <w:shd w:fill="FBFAf6" w:val="clear"/>
+          </w:tcPr>
+          <w:p>
+            <w:pPr>
+              <w:spacing w:before="40" w:after="40"/>
+              <w:jc w:val="center"/>
+            </w:pPr>
+            <w:r/>
+            <w:r>
+              <w:rPr>
+                <w:rFonts w:ascii="Calibri" w:hAnsi="Calibri" w:eastAsia="TH Sarabun New" w:cs="TH Sarabun New"/>
+                <w:b w:val="0"/>
+                <w:i w:val="0"/>
+                <w:color w:val="1F3348"/>
+                <w:sz w:val="26"/>
+              </w:rPr>
+              <w:t>หลักสี่(500) 69_05_20.xlsx  (แผ่น Header, volume, Queue, Report, Analysis)</w:t>
+            </w:r>
+          </w:p>
+        </w:tc>
+      </w:tr>
+      <w:tr>
+        <w:tc>
+          <w:tcPr>
+            <w:tcW w:type="dxa" w:w="4819"/>
+            <w:tcBorders>
+              <w:top w:val="single" w:sz="4" w:color="C4BBA8"/>
+              <w:left w:val="single" w:sz="4" w:color="C4BBA8"/>
+              <w:bottom w:val="single" w:sz="4" w:color="C4BBA8"/>
+              <w:right w:val="single" w:sz="4" w:color="C4BBA8"/>
+            </w:tcBorders>
+            <w:shd w:fill="ECE7DB" w:val="clear"/>
+          </w:tcPr>
+          <w:p>
+            <w:pPr>
+              <w:spacing w:before="40" w:after="40"/>
+              <w:jc w:val="left"/>
+            </w:pPr>
+            <w:r/>
+            <w:r>
+              <w:rPr>
+                <w:rFonts w:ascii="Calibri" w:hAnsi="Calibri" w:eastAsia="TH Sarabun New" w:cs="TH Sarabun New"/>
+                <w:b w:val="0"/>
+                <w:i w:val="0"/>
+                <w:color w:val="1F3348"/>
+                <w:sz w:val="26"/>
+              </w:rPr>
               <w:t>วิธีวิเคราะห์</w:t>
             </w:r>
           </w:p>
@@ -586,7 +766,7 @@
               <w:bottom w:val="single" w:sz="4" w:color="C4BBA8"/>
               <w:right w:val="single" w:sz="4" w:color="C4BBA8"/>
             </w:tcBorders>
-            <w:shd w:fill="FBFAf6" w:val="clear"/>
+            <w:shd w:fill="ECE7DB" w:val="clear"/>
           </w:tcPr>
           <w:p>
             <w:pPr>
@@ -627,6 +807,118 @@
           <w:sz w:val="28"/>
         </w:rPr>
         <w:t>เอกสารนี้จัดทำจากข้อมูลดิบที่สำรวจ 20 พฤษภาคม 2569 ไม่ใช่คำสั่งติดตั้งจนกว่าสำนักการจราจรและขนส่งจะรับรอง และไม่ทดแทนแบบก่อสร้าง 1:500</w:t>
+      </w:r>
+    </w:p>
+    <w:p>
+      <w:pPr>
+        <w:spacing w:after="40" w:before="0" w:line="240" w:lineRule="auto"/>
+        <w:jc w:val="center"/>
+      </w:pPr>
+      <w:r>
+        <w:rPr>
+          <w:rFonts w:ascii="Calibri" w:hAnsi="Calibri" w:eastAsia="TH Sarabun New" w:cs="TH Sarabun New"/>
+          <w:b/>
+          <w:i w:val="0"/>
+          <w:color w:val="1F3348"/>
+          <w:sz w:val="28"/>
+        </w:rPr>
+        <w:t>ลิขสิทธิ์</w:t>
+      </w:r>
+    </w:p>
+    <w:p>
+      <w:pPr>
+        <w:spacing w:after="80" w:before="0" w:line="240" w:lineRule="auto"/>
+        <w:jc w:val="center"/>
+      </w:pPr>
+      <w:r>
+        <w:rPr>
+          <w:rFonts w:ascii="Calibri" w:hAnsi="Calibri" w:eastAsia="TH Sarabun New" w:cs="TH Sarabun New"/>
+          <w:b/>
+          <w:i w:val="0"/>
+          <w:color w:val="1F3348"/>
+          <w:sz w:val="28"/>
+        </w:rPr>
+        <w:t>© Prapawadee_W.</w:t>
+      </w:r>
+    </w:p>
+    <w:p>
+      <w:pPr>
+        <w:spacing w:after="40" w:before="0" w:line="240" w:lineRule="auto"/>
+        <w:jc w:val="center"/>
+      </w:pPr>
+      <w:r>
+        <w:rPr>
+          <w:rFonts w:ascii="Calibri" w:hAnsi="Calibri" w:eastAsia="TH Sarabun New" w:cs="TH Sarabun New"/>
+          <w:b w:val="0"/>
+          <w:i w:val="0"/>
+          <w:color w:val="1F3348"/>
+          <w:sz w:val="26"/>
+        </w:rPr>
+        <w:t>จัดทำและเป็นลิขสิทธิ์ของ</w:t>
+      </w:r>
+    </w:p>
+    <w:p>
+      <w:pPr>
+        <w:spacing w:after="40" w:before="0" w:line="240" w:lineRule="auto"/>
+        <w:jc w:val="center"/>
+      </w:pPr>
+      <w:r>
+        <w:rPr>
+          <w:rFonts w:ascii="Calibri" w:hAnsi="Calibri" w:eastAsia="TH Sarabun New" w:cs="TH Sarabun New"/>
+          <w:b/>
+          <w:i w:val="0"/>
+          <w:color w:val="1F3348"/>
+          <w:sz w:val="28"/>
+        </w:rPr>
+        <w:t>PRAPAWADEE WACHIRAPUT</w:t>
+      </w:r>
+    </w:p>
+    <w:p>
+      <w:pPr>
+        <w:spacing w:after="0" w:before="0" w:line="240" w:lineRule="auto"/>
+        <w:jc w:val="center"/>
+      </w:pPr>
+      <w:r>
+        <w:rPr>
+          <w:rFonts w:ascii="Calibri" w:hAnsi="Calibri" w:eastAsia="TH Sarabun New" w:cs="TH Sarabun New"/>
+          <w:b w:val="0"/>
+          <w:i w:val="0"/>
+          <w:color w:val="1F3348"/>
+          <w:sz w:val="26"/>
+        </w:rPr>
+        <w:t>นักวิชาการสถิติชำนาญการ  ·  กลุ่มงานสถิติและวิจัย</w:t>
+      </w:r>
+    </w:p>
+    <w:p>
+      <w:pPr>
+        <w:spacing w:after="120" w:before="0" w:line="240" w:lineRule="auto"/>
+        <w:jc w:val="center"/>
+      </w:pPr>
+      <w:r>
+        <w:rPr>
+          <w:rFonts w:ascii="Calibri" w:hAnsi="Calibri" w:eastAsia="TH Sarabun New" w:cs="TH Sarabun New"/>
+          <w:b w:val="0"/>
+          <w:i w:val="0"/>
+          <w:color w:val="1F3348"/>
+          <w:sz w:val="26"/>
+        </w:rPr>
+        <w:t>กองนโยบายและแผนงาน  ·  สำนักการจราจรและขนส่ง กรุงเทพมหานคร</w:t>
+      </w:r>
+    </w:p>
+    <w:p>
+      <w:pPr>
+        <w:spacing w:after="160" w:before="0" w:line="240" w:lineRule="auto"/>
+        <w:jc w:val="center"/>
+      </w:pPr>
+      <w:r>
+        <w:rPr>
+          <w:rFonts w:ascii="Calibri" w:hAnsi="Calibri" w:eastAsia="TH Sarabun New" w:cs="TH Sarabun New"/>
+          <w:b/>
+          <w:i w:val="0"/>
+          <w:color w:val="1F3348"/>
+          <w:sz w:val="28"/>
+        </w:rPr>
+        <w:t>ไม่อนุญาตให้นำไปใช้เพื่อผลประโยชน์ส่วนบุคคล</w:t>
       </w:r>
     </w:p>
     <w:p>

</xml_diff>

<commit_message>
Replace flare drawing with official CAD plan
Use รูปผายปากแยกหลักสี่.png (153 sq.m, Protection Zone A 3.00 m)
on the geometry page, analysis document, and Word report.
</commit_message>
<xml_diff>
--- a/public/docs/laksi-500-intersection-oa.docx
+++ b/public/docs/laksi-500-intersection-oa.docx
@@ -2697,7 +2697,7 @@
       <w:r>
         <w:drawing>
           <wp:inline xmlns:a="http://schemas.openxmlformats.org/drawingml/2006/main" xmlns:pic="http://schemas.openxmlformats.org/drawingml/2006/picture">
-            <wp:extent cx="5940000" cy="3342556"/>
+            <wp:extent cx="5940000" cy="3343026"/>
             <wp:docPr id="2" name="Picture 2"/>
             <wp:cNvGraphicFramePr>
               <a:graphicFrameLocks noChangeAspect="1"/>
@@ -2706,7 +2706,7 @@
               <a:graphicData uri="http://schemas.openxmlformats.org/drawingml/2006/picture">
                 <pic:pic>
                   <pic:nvPicPr>
-                    <pic:cNvPr id="0" name="S__22405134.jpg"/>
+                    <pic:cNvPr id="0" name="รูปผายปากแยกหลักสี่.png"/>
                     <pic:cNvPicPr/>
                   </pic:nvPicPr>
                   <pic:blipFill>
@@ -2718,7 +2718,7 @@
                   <pic:spPr>
                     <a:xfrm>
                       <a:off x="0" y="0"/>
-                      <a:ext cx="5940000" cy="3342556"/>
+                      <a:ext cx="5940000" cy="3343026"/>
                     </a:xfrm>
                     <a:prstGeom prst="rect"/>
                   </pic:spPr>
@@ -2742,7 +2742,7 @@
           <w:color w:val="6B6459"/>
           <w:sz w:val="24"/>
         </w:rPr>
-        <w:t>ภาพที่ 2  รูปแบบบริเวณที่จะทำการผายปาก ตามแบบเขตหลักสี่ (ไฟล์ที่แนบใน Grok)</w:t>
+        <w:t>ภาพที่ 2  รูปแบบบริเวณที่จะทำการผายปาก — พื้นที่ขยายเขตทางประมาณ 153.00 ตร.ม. ระยะร่น Protection Zone A 3.00 ม. (ไฟล์แบบที่แนบใน Grok)</w:t>
       </w:r>
     </w:p>
     <w:p>

</xml_diff>

<commit_message>
Remove originating memo from the presentation
Drop the บันทึกต้นเรื่อง card, scanned letter, and memo numbers
from the app, Word report, and README.
</commit_message>
<xml_diff>
--- a/public/docs/laksi-500-intersection-oa.docx
+++ b/public/docs/laksi-500-intersection-oa.docx
@@ -513,7 +513,7 @@
                 <w:color w:val="1F3348"/>
                 <w:sz w:val="26"/>
               </w:rPr>
-              <w:t>บันทึกต้นเรื่อง</w:t>
+              <w:t>แหล่งข้อมูลดิบ</w:t>
             </w:r>
           </w:p>
         </w:tc>
@@ -542,7 +542,7 @@
                 <w:color w:val="1F3348"/>
                 <w:sz w:val="26"/>
               </w:rPr>
-              <w:t>กท ๗๘๑๑/๓๙๗๗  ลงวันที่ 10 สิงหาคม 2569</w:t>
+              <w:t>หลักสี่(500) 69_05_20.xlsx  (แผ่น Header, volume, Queue, Report, Analysis)</w:t>
             </w:r>
           </w:p>
         </w:tc>
@@ -573,7 +573,7 @@
                 <w:color w:val="1F3348"/>
                 <w:sz w:val="26"/>
               </w:rPr>
-              <w:t>จาก / ถึง</w:t>
+              <w:t>วิธีวิเคราะห์</w:t>
             </w:r>
           </w:p>
         </w:tc>
@@ -587,186 +587,6 @@
               <w:right w:val="single" w:sz="4" w:color="C4BBA8"/>
             </w:tcBorders>
             <w:shd w:fill="FBFAf6" w:val="clear"/>
-          </w:tcPr>
-          <w:p>
-            <w:pPr>
-              <w:spacing w:before="40" w:after="40"/>
-              <w:jc w:val="center"/>
-            </w:pPr>
-            <w:r/>
-            <w:r>
-              <w:rPr>
-                <w:rFonts w:ascii="Calibri" w:hAnsi="Calibri" w:eastAsia="TH Sarabun New" w:cs="TH Sarabun New"/>
-                <w:b w:val="0"/>
-                <w:i w:val="0"/>
-                <w:color w:val="1F3348"/>
-                <w:sz w:val="26"/>
-              </w:rPr>
-              <w:t>นายอัมรินทร์ จารุตามระ ผู้ำนวยการเขตหลักสี่  →  ผู้อำนวยการสำนักการจราจรและขนส่ง</w:t>
-            </w:r>
-          </w:p>
-        </w:tc>
-      </w:tr>
-      <w:tr>
-        <w:tc>
-          <w:tcPr>
-            <w:tcW w:type="dxa" w:w="4819"/>
-            <w:tcBorders>
-              <w:top w:val="single" w:sz="4" w:color="C4BBA8"/>
-              <w:left w:val="single" w:sz="4" w:color="C4BBA8"/>
-              <w:bottom w:val="single" w:sz="4" w:color="C4BBA8"/>
-              <w:right w:val="single" w:sz="4" w:color="C4BBA8"/>
-            </w:tcBorders>
-            <w:shd w:fill="ECE7DB" w:val="clear"/>
-          </w:tcPr>
-          <w:p>
-            <w:pPr>
-              <w:spacing w:before="40" w:after="40"/>
-              <w:jc w:val="left"/>
-            </w:pPr>
-            <w:r/>
-            <w:r>
-              <w:rPr>
-                <w:rFonts w:ascii="Calibri" w:hAnsi="Calibri" w:eastAsia="TH Sarabun New" w:cs="TH Sarabun New"/>
-                <w:b w:val="0"/>
-                <w:i w:val="0"/>
-                <w:color w:val="1F3348"/>
-                <w:sz w:val="26"/>
-              </w:rPr>
-              <w:t>รับเรื่อง สจส.</w:t>
-            </w:r>
-          </w:p>
-        </w:tc>
-        <w:tc>
-          <w:tcPr>
-            <w:tcW w:type="dxa" w:w="4819"/>
-            <w:tcBorders>
-              <w:top w:val="single" w:sz="4" w:color="C4BBA8"/>
-              <w:left w:val="single" w:sz="4" w:color="C4BBA8"/>
-              <w:bottom w:val="single" w:sz="4" w:color="C4BBA8"/>
-              <w:right w:val="single" w:sz="4" w:color="C4BBA8"/>
-            </w:tcBorders>
-            <w:shd w:fill="ECE7DB" w:val="clear"/>
-          </w:tcPr>
-          <w:p>
-            <w:pPr>
-              <w:spacing w:before="40" w:after="40"/>
-              <w:jc w:val="center"/>
-            </w:pPr>
-            <w:r/>
-            <w:r>
-              <w:rPr>
-                <w:rFonts w:ascii="Calibri" w:hAnsi="Calibri" w:eastAsia="TH Sarabun New" w:cs="TH Sarabun New"/>
-                <w:b w:val="0"/>
-                <w:i w:val="0"/>
-                <w:color w:val="1F3348"/>
-                <w:sz w:val="26"/>
-              </w:rPr>
-              <w:t>ช.1088/69  11 สิงหาคม 2569  ·  กลุ่มงานสถิติและวิจัย เลขรับ 446 วันที่ 13 ส.ค. 2569</w:t>
-            </w:r>
-          </w:p>
-        </w:tc>
-      </w:tr>
-      <w:tr>
-        <w:tc>
-          <w:tcPr>
-            <w:tcW w:type="dxa" w:w="4819"/>
-            <w:tcBorders>
-              <w:top w:val="single" w:sz="4" w:color="C4BBA8"/>
-              <w:left w:val="single" w:sz="4" w:color="C4BBA8"/>
-              <w:bottom w:val="single" w:sz="4" w:color="C4BBA8"/>
-              <w:right w:val="single" w:sz="4" w:color="C4BBA8"/>
-            </w:tcBorders>
-            <w:shd w:fill="FBFAf6" w:val="clear"/>
-          </w:tcPr>
-          <w:p>
-            <w:pPr>
-              <w:spacing w:before="40" w:after="40"/>
-              <w:jc w:val="left"/>
-            </w:pPr>
-            <w:r/>
-            <w:r>
-              <w:rPr>
-                <w:rFonts w:ascii="Calibri" w:hAnsi="Calibri" w:eastAsia="TH Sarabun New" w:cs="TH Sarabun New"/>
-                <w:b w:val="0"/>
-                <w:i w:val="0"/>
-                <w:color w:val="1F3348"/>
-                <w:sz w:val="26"/>
-              </w:rPr>
-              <w:t>แหล่งข้อมูลดิบ</w:t>
-            </w:r>
-          </w:p>
-        </w:tc>
-        <w:tc>
-          <w:tcPr>
-            <w:tcW w:type="dxa" w:w="4819"/>
-            <w:tcBorders>
-              <w:top w:val="single" w:sz="4" w:color="C4BBA8"/>
-              <w:left w:val="single" w:sz="4" w:color="C4BBA8"/>
-              <w:bottom w:val="single" w:sz="4" w:color="C4BBA8"/>
-              <w:right w:val="single" w:sz="4" w:color="C4BBA8"/>
-            </w:tcBorders>
-            <w:shd w:fill="FBFAf6" w:val="clear"/>
-          </w:tcPr>
-          <w:p>
-            <w:pPr>
-              <w:spacing w:before="40" w:after="40"/>
-              <w:jc w:val="center"/>
-            </w:pPr>
-            <w:r/>
-            <w:r>
-              <w:rPr>
-                <w:rFonts w:ascii="Calibri" w:hAnsi="Calibri" w:eastAsia="TH Sarabun New" w:cs="TH Sarabun New"/>
-                <w:b w:val="0"/>
-                <w:i w:val="0"/>
-                <w:color w:val="1F3348"/>
-                <w:sz w:val="26"/>
-              </w:rPr>
-              <w:t>หลักสี่(500) 69_05_20.xlsx  (แผ่น Header, volume, Queue, Report, Analysis)</w:t>
-            </w:r>
-          </w:p>
-        </w:tc>
-      </w:tr>
-      <w:tr>
-        <w:tc>
-          <w:tcPr>
-            <w:tcW w:type="dxa" w:w="4819"/>
-            <w:tcBorders>
-              <w:top w:val="single" w:sz="4" w:color="C4BBA8"/>
-              <w:left w:val="single" w:sz="4" w:color="C4BBA8"/>
-              <w:bottom w:val="single" w:sz="4" w:color="C4BBA8"/>
-              <w:right w:val="single" w:sz="4" w:color="C4BBA8"/>
-            </w:tcBorders>
-            <w:shd w:fill="ECE7DB" w:val="clear"/>
-          </w:tcPr>
-          <w:p>
-            <w:pPr>
-              <w:spacing w:before="40" w:after="40"/>
-              <w:jc w:val="left"/>
-            </w:pPr>
-            <w:r/>
-            <w:r>
-              <w:rPr>
-                <w:rFonts w:ascii="Calibri" w:hAnsi="Calibri" w:eastAsia="TH Sarabun New" w:cs="TH Sarabun New"/>
-                <w:b w:val="0"/>
-                <w:i w:val="0"/>
-                <w:color w:val="1F3348"/>
-                <w:sz w:val="26"/>
-              </w:rPr>
-              <w:t>วิธีวิเคราะห์</w:t>
-            </w:r>
-          </w:p>
-        </w:tc>
-        <w:tc>
-          <w:tcPr>
-            <w:tcW w:type="dxa" w:w="4819"/>
-            <w:tcBorders>
-              <w:top w:val="single" w:sz="4" w:color="C4BBA8"/>
-              <w:left w:val="single" w:sz="4" w:color="C4BBA8"/>
-              <w:bottom w:val="single" w:sz="4" w:color="C4BBA8"/>
-              <w:right w:val="single" w:sz="4" w:color="C4BBA8"/>
-            </w:tcBorders>
-            <w:shd w:fill="ECE7DB" w:val="clear"/>
           </w:tcPr>
           <w:p>
             <w:pPr>
@@ -1213,7 +1033,7 @@
           <w:color w:val="1F3348"/>
           <w:sz w:val="32"/>
         </w:rPr>
-        <w:t>เขตหลักสี่มีหนังสือถึงผู้อำนวยการสำนักการจราจรและขนส่ง ขอคำนวณปริมาณรถบริเวณแยกหลักสี่ ถนนแจ้งวัฒนะตัดถนนกำแพงเพชร 6 เพื่อประกอบโครงการปาดผายมุมทางเลี้ยวซ้าย ให้มีรัศมีวงเลี้ยวเพิ่มขึ้น แก้ไขปัญหาจราจรติดขัดบริเวณถนนแจ้งวัฒนะเลี้ยวซ้ายเข้าถนนกำแพงเพชร 6 ด้านทิศเหนือ</w:t>
+        <w:t>โครงการปาดผายมุมทางเลี้ยวซ้ายแยกหลักสี่ ถนนแจ้งวัฒนะตัดถนนกำแพงเพชร 6 เพื่อเพิ่มรัศมีวงเลี้ยว แก้ไขปัญหาจราจรติดขัดบริเวณถนนแจ้งวัฒนะเลี้ยวซ้ายเข้าถนนกำแพงเพชร 6 ด้านทิศเหนือ</w:t>
       </w:r>
     </w:p>
     <w:p>
@@ -1229,7 +1049,7 @@
           <w:color w:val="1F3348"/>
           <w:sz w:val="32"/>
         </w:rPr>
-        <w:t>รายงานวิเคราะห์ฉบับก่อนที่แนบมาด้วย (รายงานวิเคราะห์สภาพการจราจรทางแยก_ฉบับสมบูรณ์) ใช้ทิศ NB เลี้ยวซ้าย ซึ่งไม่ตรงบันทึกข้อความ และมีค่า PCU บางช่วงผิดปกติ รายงานฉบับนี้ใช้ทิศทางตามบันทึก คือ EB5 (แจ้งวัฒนะขาเข้า เลี้ยวซ้ายเข้ากำแพงเพชร 6 ทิศเหนือ) และคำนวณใหม่จากแผ่น volume / Analysis / Queue ของไฟล์สำรวจดิบ</w:t>
+        <w:t>รายงานวิเคราะห์ฉบับก่อนใช้ทิศ NB เลี้ยวซ้าย และมีค่า PCU บางช่วงผิดปกติ รายงานฉบับนี้ใช้ทิศทางเป้าหมาย คือ EB5 (แจ้งวัฒนะขาเข้า เลี้ยวซ้ายเข้ากำแพงเพชร 6 ทิศเหนือ) และคำนวณใหม่จากแผ่น volume / Analysis / Queue ของไฟล์สำรวจดิบ</w:t>
       </w:r>
     </w:p>
     <w:p>
@@ -1355,7 +1175,7 @@
           <w:color w:val="1F3348"/>
           <w:sz w:val="32"/>
         </w:rPr>
-        <w:t>ศึกษาสี่แยกสัญญาณไฟตู้ 500 เท่านั้น ประสานกับตู้ 360 (แยกหลักสี่–วิภาวดี ห่างประมาณ 80 เมตร) ในระดับ OFFSET ไม่จำลองจุลภาคทั้งสายแจ้งวัฒนะ และไม่ประเมินอุบัติเหตุย้อนหลังเพราะไม่มีแฟ้มอุบัติเหตุประกอบบันทึก</w:t>
+        <w:t>ศึกษาสี่แยกสัญญาณไฟตู้ 500 เท่านั้น ประสานกับตู้ 360 (แยกหลักสี่–วิภาวดี ห่างประมาณ 80 เมตร) ในระดับ OFFSET ไม่จำลองจุลภาคทั้งสายแจ้งวัฒนะ และไม่ประเมินอุบัติเหตุย้อนหลังเพราะไม่มีแฟ้มอุบัติเหตุประกอบการศึกษา</w:t>
       </w:r>
     </w:p>
     <w:p>
@@ -2632,62 +2452,7 @@
           <w:color w:val="1F3348"/>
           <w:sz w:val="32"/>
         </w:rPr>
-        <w:t>ทิศเป้าหมายตามบันทึก: รถบนถนนแจ้งวัฒนะขาเข้า (ตะวันตก→ตะวันออก) เลี้ยวซ้ายเข้ากำแพงเพชร 6 ด้านทิศเหนือ รหัสนับในไฟล์ดิบคือ EB5</w:t>
-      </w:r>
-    </w:p>
-    <w:p>
-      <w:pPr>
-        <w:jc w:val="center"/>
-      </w:pPr>
-      <w:r>
-        <w:drawing>
-          <wp:inline xmlns:a="http://schemas.openxmlformats.org/drawingml/2006/main" xmlns:pic="http://schemas.openxmlformats.org/drawingml/2006/picture">
-            <wp:extent cx="5940000" cy="10555875"/>
-            <wp:docPr id="1" name="Picture 1"/>
-            <wp:cNvGraphicFramePr>
-              <a:graphicFrameLocks noChangeAspect="1"/>
-            </wp:cNvGraphicFramePr>
-            <a:graphic>
-              <a:graphicData uri="http://schemas.openxmlformats.org/drawingml/2006/picture">
-                <pic:pic>
-                  <pic:nvPicPr>
-                    <pic:cNvPr id="0" name="627218008678859434.jpg"/>
-                    <pic:cNvPicPr/>
-                  </pic:nvPicPr>
-                  <pic:blipFill>
-                    <a:blip r:embed="rId11"/>
-                    <a:stretch>
-                      <a:fillRect/>
-                    </a:stretch>
-                  </pic:blipFill>
-                  <pic:spPr>
-                    <a:xfrm>
-                      <a:off x="0" y="0"/>
-                      <a:ext cx="5940000" cy="10555875"/>
-                    </a:xfrm>
-                    <a:prstGeom prst="rect"/>
-                  </pic:spPr>
-                </pic:pic>
-              </a:graphicData>
-            </a:graphic>
-          </wp:inline>
-        </w:drawing>
-      </w:r>
-    </w:p>
-    <w:p>
-      <w:pPr>
-        <w:spacing w:after="200" w:before="0" w:line="240" w:lineRule="auto"/>
-        <w:jc w:val="both"/>
-      </w:pPr>
-      <w:r>
-        <w:rPr>
-          <w:rFonts w:ascii="Calibri" w:hAnsi="Calibri" w:eastAsia="TH Sarabun New" w:cs="TH Sarabun New"/>
-          <w:b w:val="0"/>
-          <w:i/>
-          <w:color w:val="6B6459"/>
-          <w:sz w:val="24"/>
-        </w:rPr>
-        <w:t>ภาพที่ 1  บันทึกข้อความต้นเรื่อง กท ๗๘๑๑/๓๙๗๗ (ไฟล์ที่แนบใน Grok)</w:t>
+        <w:t>ทิศเป้าหมาย: รถบนถนนแจ้งวัฒนะขาเข้า (ตะวันตก→ตะวันออก) เลี้ยวซ้ายเข้ากำแพงเพชร 6 ด้านทิศเหนือ รหัสนับในไฟล์ดิบคือ EB5</w:t>
       </w:r>
     </w:p>
     <w:p>
@@ -2698,7 +2463,7 @@
         <w:drawing>
           <wp:inline xmlns:a="http://schemas.openxmlformats.org/drawingml/2006/main" xmlns:pic="http://schemas.openxmlformats.org/drawingml/2006/picture">
             <wp:extent cx="5940000" cy="3343026"/>
-            <wp:docPr id="2" name="Picture 2"/>
+            <wp:docPr id="1" name="Picture 1"/>
             <wp:cNvGraphicFramePr>
               <a:graphicFrameLocks noChangeAspect="1"/>
             </wp:cNvGraphicFramePr>
@@ -2710,7 +2475,7 @@
                     <pic:cNvPicPr/>
                   </pic:nvPicPr>
                   <pic:blipFill>
-                    <a:blip r:embed="rId12"/>
+                    <a:blip r:embed="rId11"/>
                     <a:stretch>
                       <a:fillRect/>
                     </a:stretch>
@@ -2742,7 +2507,7 @@
           <w:color w:val="6B6459"/>
           <w:sz w:val="24"/>
         </w:rPr>
-        <w:t>ภาพที่ 2  รูปแบบบริเวณที่จะทำการผายปาก — พื้นที่ขยายเขตทางประมาณ 153.00 ตร.ม. ระยะร่น Protection Zone A 3.00 ม. (ไฟล์แบบที่แนบใน Grok)</w:t>
+        <w:t>ภาพที่ 1  รูปแบบบริเวณที่จะทำการผายปาก — พื้นที่ขยายเขตทางประมาณ 153.00 ตร.ม. ระยะร่น Protection Zone A 3.00 ม.</w:t>
       </w:r>
     </w:p>
     <w:p>
@@ -6293,7 +6058,7 @@
           <w:color w:val="6B6459"/>
           <w:sz w:val="24"/>
         </w:rPr>
-        <w:t>ที่มา: รวมจากแผ่น Report / Analysis — แถว EB5 คือทิศตามบันทึกข้อความ</w:t>
+        <w:t>ที่มา: รวมจากแผ่น Report / Analysis — แถว EB5 คือทิศเป้าหมายของโครงการ</w:t>
       </w:r>
     </w:p>
     <w:p>
@@ -17640,7 +17405,7 @@
           <w:color w:val="1F3348"/>
           <w:sz w:val="36"/>
         </w:rPr>
-        <w:t>10.1  คำตอบสามข้อในบันทึกข้อความ</w:t>
+        <w:t>10.1  สรุปผลหลัก</w:t>
       </w:r>
     </w:p>
     <w:p>
@@ -17656,7 +17421,7 @@
           <w:color w:val="1F3348"/>
           <w:sz w:val="32"/>
         </w:rPr>
-        <w:t>ข้อ 1 ปริมาณช่วงเร่งด่วน — เช้า 07:00–09:00 รวม 472 คัน เย็น 16:00–18:00 รวม 628 คัน พีคจริงของทิศนี้คือ 12:00–13:00 ที่ 342 คัน/ชม. จากแผ่น Report</w:t>
+        <w:t>ปริมาณช่วงเร่งด่วน — เช้า 07:00–09:00 รวม 472 คัน เย็น 16:00–18:00 รวม 628 คัน พีคจริงของทิศนี้คือ 12:00–13:00 ที่ 342 คัน/ชม. จากแผ่น Report</w:t>
       </w:r>
     </w:p>
     <w:p>
@@ -17672,7 +17437,7 @@
           <w:color w:val="1F3348"/>
           <w:sz w:val="32"/>
         </w:rPr>
-        <w:t>ข้อ 2 ใช้เส้นทางนี้ทั้งวัน — 3,330 คัน ใน 12 ชั่วโมง (3,348.5 PCU) คิดเป็น 8.2% ของรถทั้งแยก</w:t>
+        <w:t>ใช้เส้นทางนี้ทั้งวัน — 3,330 คัน ใน 12 ชั่วโมง (3,348.5 PCU) คิดเป็น 8.2% ของรถทั้งแยก</w:t>
       </w:r>
     </w:p>
     <w:p>
@@ -17688,7 +17453,7 @@
           <w:color w:val="1F3348"/>
           <w:sz w:val="32"/>
         </w:rPr>
-        <w:t>ข้อ 3 ช่วยได้มากน้อย — ความจุเหลือเฟือ (v/c 0.64 LOS C) หน่วงลดจาก 158 เหลือ 18 วินาที/คัน และดึง 15–20% ของขา EB ออกจากไฟ ซึ่งเป็นขาที่คิวยาวที่สุดในแผ่น Queue (200 ม.)</w:t>
+        <w:t>ผลของผายปาก — ความจุเหลือเฟือ (v/c 0.64 LOS C) หน่วงลดจาก 158 เหลือ 18 วินาที/คัน และดึง 15–20% ของขา EB ออกจากไฟ ซึ่งเป็นขาที่คิวยาวที่สุดในแผ่น Queue (200 ม.)</w:t>
       </w:r>
     </w:p>
     <w:p>
@@ -18276,7 +18041,7 @@
           <w:color w:val="1F3348"/>
           <w:sz w:val="28"/>
         </w:rPr>
-        <w:t>10.  เขตหลักสี่. บันทึกข้อความ กท ๗๘๑๑/๓๙๗๗ ลงวันที่ 10 สิงหาคม 2569.</w:t>
+        <w:t>10.  บริษัท ศรีทองเจริญ จำกัด. แผ่นติดตั้งเครื่องควบคุมสัญญาณไฟจราจร ตู้ 500 (ไฟล์สแกนที่แนบ).</w:t>
       </w:r>
     </w:p>
     <w:p>
@@ -18292,23 +18057,7 @@
           <w:color w:val="1F3348"/>
           <w:sz w:val="28"/>
         </w:rPr>
-        <w:t>11.  บริษัท ศรีทองเจริญ จำกัด. แผ่นติดตั้งเครื่องควบคุมสัญญาณไฟจราจร ตู้ 500 (ไฟล์สแกนที่แนบ).</w:t>
-      </w:r>
-    </w:p>
-    <w:p>
-      <w:pPr>
-        <w:spacing w:after="80" w:before="0" w:line="240" w:lineRule="auto"/>
-        <w:jc w:val="both"/>
-      </w:pPr>
-      <w:r>
-        <w:rPr>
-          <w:rFonts w:ascii="Calibri" w:hAnsi="Calibri" w:eastAsia="TH Sarabun New" w:cs="TH Sarabun New"/>
-          <w:b w:val="0"/>
-          <w:i w:val="0"/>
-          <w:color w:val="1F3348"/>
-          <w:sz w:val="28"/>
-        </w:rPr>
-        <w:t>12.  เขตหลักสี่. รูปแบบบริเวณที่จะทำการผายปาก แยกหลักสี่ (แบบขอใช้พื้นที่ ที่แนบ).</w:t>
+        <w:t>11.  รูปแบบบริเวณที่จะทำการผายปาก แยกหลักสี่ (แบบขอใช้พื้นที่ ที่แนบ).</w:t>
       </w:r>
     </w:p>
     <w:p>

</xml_diff>

<commit_message>
Use official bureaucratic wording from the attached report
Align titles, rationale, objectives, findings, recommendations,
and analyst signature with the formal traffic-engineering report.
</commit_message>
<xml_diff>
--- a/public/docs/laksi-500-intersection-oa.docx
+++ b/public/docs/laksi-500-intersection-oa.docx
@@ -47,9 +47,41 @@
           <w:b/>
           <w:i w:val="0"/>
           <w:color w:val="1F3348"/>
-          <w:sz w:val="52"/>
+          <w:sz w:val="48"/>
         </w:rPr>
-        <w:t>รายงานวิเคราะห์สภาพการจราจรทางแยก</w:t>
+        <w:t>รายงานการวิเคราะห์ปริมาณการจราจรทางแยกหลักสี่</w:t>
+      </w:r>
+    </w:p>
+    <w:p>
+      <w:pPr>
+        <w:spacing w:after="200" w:before="0" w:line="240" w:lineRule="auto"/>
+        <w:jc w:val="center"/>
+      </w:pPr>
+      <w:r>
+        <w:rPr>
+          <w:rFonts w:ascii="Calibri" w:hAnsi="Calibri" w:eastAsia="TH Sarabun New" w:cs="TH Sarabun New"/>
+          <w:b/>
+          <w:i w:val="0"/>
+          <w:color w:val="1F3348"/>
+          <w:sz w:val="36"/>
+        </w:rPr>
+        <w:t>(แยกไอทีสแควร์)</w:t>
+      </w:r>
+    </w:p>
+    <w:p>
+      <w:pPr>
+        <w:spacing w:after="80" w:before="0" w:line="240" w:lineRule="auto"/>
+        <w:jc w:val="center"/>
+      </w:pPr>
+      <w:r>
+        <w:rPr>
+          <w:rFonts w:ascii="Calibri" w:hAnsi="Calibri" w:eastAsia="TH Sarabun New" w:cs="TH Sarabun New"/>
+          <w:b w:val="0"/>
+          <w:i w:val="0"/>
+          <w:color w:val="1F3348"/>
+          <w:sz w:val="28"/>
+        </w:rPr>
+        <w:t>ตามรูปแบบวิศวกรรมจราจร — ปริมาณจราจร แถวคอย ความจุ และแบบสัญญาณไฟจราจร</w:t>
       </w:r>
     </w:p>
     <w:p>
@@ -61,27 +93,11 @@
         <w:rPr>
           <w:rFonts w:ascii="Calibri" w:hAnsi="Calibri" w:eastAsia="TH Sarabun New" w:cs="TH Sarabun New"/>
           <w:b w:val="0"/>
-          <w:i/>
-          <w:color w:val="1F3348"/>
-          <w:sz w:val="32"/>
-        </w:rPr>
-        <w:t>Intersection Operational Analysis</w:t>
-      </w:r>
-    </w:p>
-    <w:p>
-      <w:pPr>
-        <w:spacing w:after="80" w:before="0" w:line="240" w:lineRule="auto"/>
-        <w:jc w:val="center"/>
-      </w:pPr>
-      <w:r>
-        <w:rPr>
-          <w:rFonts w:ascii="Calibri" w:hAnsi="Calibri" w:eastAsia="TH Sarabun New" w:cs="TH Sarabun New"/>
-          <w:b/>
           <w:i w:val="0"/>
           <w:color w:val="1F3348"/>
-          <w:sz w:val="40"/>
+          <w:sz w:val="28"/>
         </w:rPr>
-        <w:t>แยกหลักสี่พลาซ่า (แยกไอทีสแควร์)</w:t>
+        <w:t>เพื่อวิเคราะห์การแก้ไขปัญหาจราจรในทางเลี้ยวซ้ายจากถนนแจ้งวัฒนะ เข้าถนนกำแพงเพชร 6 ทางทิศเหนือ</w:t>
       </w:r>
     </w:p>
     <w:p>
@@ -113,7 +129,7 @@
           <w:color w:val="1F3348"/>
           <w:sz w:val="32"/>
         </w:rPr>
-        <w:t>สัญญาณไฟจราจร หมายเลข 500  ·  รหัส N176</w:t>
+        <w:t>สัญญาณไฟจราจรหมายเลข 500  ·  รหัส N176</w:t>
       </w:r>
     </w:p>
     <w:tbl>
@@ -213,7 +229,7 @@
                 <w:color w:val="1F3348"/>
                 <w:sz w:val="26"/>
               </w:rPr>
-              <w:t>ผู้จัดทำ / ลิขสิทธิ์</w:t>
+              <w:t>ผู้วิเคราะห์ข้อมูลและจัดทำรายงาน</w:t>
             </w:r>
           </w:p>
         </w:tc>
@@ -242,7 +258,7 @@
                 <w:color w:val="1F3348"/>
                 <w:sz w:val="26"/>
               </w:rPr>
-              <w:t>PRAPAWADEE WACHIRAPUT  © Prapawadee_W.</w:t>
+              <w:t>นางสาวประภาวดี วชิรพุทธิ์  © Prapawadee_W.</w:t>
             </w:r>
           </w:p>
         </w:tc>
@@ -273,7 +289,7 @@
                 <w:color w:val="1F3348"/>
                 <w:sz w:val="26"/>
               </w:rPr>
-              <w:t>สังกัด</w:t>
+              <w:t>ตำแหน่ง</w:t>
             </w:r>
           </w:p>
         </w:tc>
@@ -302,7 +318,7 @@
                 <w:color w:val="1F3348"/>
                 <w:sz w:val="26"/>
               </w:rPr>
-              <w:t>นักวิชาการสถิติชำนาญการ  กลุ่มงานสถิติและวิจัย</w:t>
+              <w:t>นักวิชาการสถิติชำนาญการ</w:t>
             </w:r>
           </w:p>
         </w:tc>
@@ -333,7 +349,7 @@
                 <w:color w:val="1F3348"/>
                 <w:sz w:val="26"/>
               </w:rPr>
-              <w:t>กอง / สำนัก</w:t>
+              <w:t>สังกัด</w:t>
             </w:r>
           </w:p>
         </w:tc>
@@ -362,7 +378,7 @@
                 <w:color w:val="1F3348"/>
                 <w:sz w:val="26"/>
               </w:rPr>
-              <w:t>กองนโยบายและแผนงาน  สำนักการจราจรและขนส่ง กรุงเทพมหานคร</w:t>
+              <w:t>กลุ่มงานสถิติและวิจัย  กองนโยบายและแผนงาน</w:t>
             </w:r>
           </w:p>
         </w:tc>
@@ -393,7 +409,7 @@
                 <w:color w:val="1F3348"/>
                 <w:sz w:val="26"/>
               </w:rPr>
-              <w:t>วันสำรวจ</w:t>
+              <w:t>สำนัก</w:t>
             </w:r>
           </w:p>
         </w:tc>
@@ -422,7 +438,7 @@
                 <w:color w:val="1F3348"/>
                 <w:sz w:val="26"/>
               </w:rPr>
-              <w:t>20 พฤษภาคม 2569 (วันพุธ)  อากาศปกติ</w:t>
+              <w:t>สำนักการจราจรและขนส่ง กรุงเทพมหานคร</w:t>
             </w:r>
           </w:p>
         </w:tc>
@@ -453,7 +469,7 @@
                 <w:color w:val="1F3348"/>
                 <w:sz w:val="26"/>
               </w:rPr>
-              <w:t>พิกัด</w:t>
+              <w:t>วันสำรวจ</w:t>
             </w:r>
           </w:p>
         </w:tc>
@@ -482,7 +498,7 @@
                 <w:color w:val="1F3348"/>
                 <w:sz w:val="26"/>
               </w:rPr>
-              <w:t>13.884608°N  100.580908°E</w:t>
+              <w:t>20 พฤษภาคม 2569 (วันพุธ)  อากาศปกติ</w:t>
             </w:r>
           </w:p>
         </w:tc>
@@ -513,7 +529,7 @@
                 <w:color w:val="1F3348"/>
                 <w:sz w:val="26"/>
               </w:rPr>
-              <w:t>แหล่งข้อมูลดิบ</w:t>
+              <w:t>พิกัด</w:t>
             </w:r>
           </w:p>
         </w:tc>
@@ -542,7 +558,7 @@
                 <w:color w:val="1F3348"/>
                 <w:sz w:val="26"/>
               </w:rPr>
-              <w:t>หลักสี่(500) 69_05_20.xlsx  (แผ่น Header, volume, Queue, Report, Analysis)</w:t>
+              <w:t>13.884608°N  100.580908°E</w:t>
             </w:r>
           </w:p>
         </w:tc>
@@ -573,7 +589,7 @@
                 <w:color w:val="1F3348"/>
                 <w:sz w:val="26"/>
               </w:rPr>
-              <w:t>วิธีวิเคราะห์</w:t>
+              <w:t>แหล่งข้อมูลดิบ</w:t>
             </w:r>
           </w:p>
         </w:tc>
@@ -587,6 +603,66 @@
               <w:right w:val="single" w:sz="4" w:color="C4BBA8"/>
             </w:tcBorders>
             <w:shd w:fill="FBFAf6" w:val="clear"/>
+          </w:tcPr>
+          <w:p>
+            <w:pPr>
+              <w:spacing w:before="40" w:after="40"/>
+              <w:jc w:val="center"/>
+            </w:pPr>
+            <w:r/>
+            <w:r>
+              <w:rPr>
+                <w:rFonts w:ascii="Calibri" w:hAnsi="Calibri" w:eastAsia="TH Sarabun New" w:cs="TH Sarabun New"/>
+                <w:b w:val="0"/>
+                <w:i w:val="0"/>
+                <w:color w:val="1F3348"/>
+                <w:sz w:val="26"/>
+              </w:rPr>
+              <w:t>หลักสี่(500) 69_05_20.xlsx  (แผ่น Header, volume, Queue, Report, Analysis)</w:t>
+            </w:r>
+          </w:p>
+        </w:tc>
+      </w:tr>
+      <w:tr>
+        <w:tc>
+          <w:tcPr>
+            <w:tcW w:type="dxa" w:w="4819"/>
+            <w:tcBorders>
+              <w:top w:val="single" w:sz="4" w:color="C4BBA8"/>
+              <w:left w:val="single" w:sz="4" w:color="C4BBA8"/>
+              <w:bottom w:val="single" w:sz="4" w:color="C4BBA8"/>
+              <w:right w:val="single" w:sz="4" w:color="C4BBA8"/>
+            </w:tcBorders>
+            <w:shd w:fill="ECE7DB" w:val="clear"/>
+          </w:tcPr>
+          <w:p>
+            <w:pPr>
+              <w:spacing w:before="40" w:after="40"/>
+              <w:jc w:val="left"/>
+            </w:pPr>
+            <w:r/>
+            <w:r>
+              <w:rPr>
+                <w:rFonts w:ascii="Calibri" w:hAnsi="Calibri" w:eastAsia="TH Sarabun New" w:cs="TH Sarabun New"/>
+                <w:b w:val="0"/>
+                <w:i w:val="0"/>
+                <w:color w:val="1F3348"/>
+                <w:sz w:val="26"/>
+              </w:rPr>
+              <w:t>วิธีการศึกษา</w:t>
+            </w:r>
+          </w:p>
+        </w:tc>
+        <w:tc>
+          <w:tcPr>
+            <w:tcW w:type="dxa" w:w="4819"/>
+            <w:tcBorders>
+              <w:top w:val="single" w:sz="4" w:color="C4BBA8"/>
+              <w:left w:val="single" w:sz="4" w:color="C4BBA8"/>
+              <w:bottom w:val="single" w:sz="4" w:color="C4BBA8"/>
+              <w:right w:val="single" w:sz="4" w:color="C4BBA8"/>
+            </w:tcBorders>
+            <w:shd w:fill="ECE7DB" w:val="clear"/>
           </w:tcPr>
           <w:p>
             <w:pPr>
@@ -690,7 +766,7 @@
           <w:color w:val="1F3348"/>
           <w:sz w:val="28"/>
         </w:rPr>
-        <w:t>PRAPAWADEE WACHIRAPUT</w:t>
+        <w:t>นางสาวประภาวดี วชิรพุทธิ์</w:t>
       </w:r>
     </w:p>
     <w:p>
@@ -806,7 +882,7 @@
           <w:color w:val="1F3348"/>
           <w:sz w:val="32"/>
         </w:rPr>
-        <w:t>บทที่ 3  วิธีการศึกษาและมาตรฐาน</w:t>
+        <w:t>บทที่ 3  วิธีการศึกษาและมาตรฐานตามหลักวิศวกรรมจราจร</w:t>
       </w:r>
     </w:p>
     <w:p>
@@ -822,7 +898,7 @@
           <w:color w:val="1F3348"/>
           <w:sz w:val="32"/>
         </w:rPr>
-        <w:t>บทที่ 4  ผลการสำรวจปริมาณจราจร (จากข้อมูลดิบ)</w:t>
+        <w:t>บทที่ 4  ผลการสำรวจและวิเคราะห์ข้อมูล</w:t>
       </w:r>
     </w:p>
     <w:p>
@@ -838,7 +914,7 @@
           <w:color w:val="1F3348"/>
           <w:sz w:val="32"/>
         </w:rPr>
-        <w:t>บทที่ 5  แถวคอยและระดับบริการปัจจุบัน</w:t>
+        <w:t>บทที่ 5  แถวคอยและระดับการให้บริการปัจจุบัน</w:t>
       </w:r>
     </w:p>
     <w:p>
@@ -886,7 +962,7 @@
           <w:color w:val="1F3348"/>
           <w:sz w:val="32"/>
         </w:rPr>
-        <w:t>บทที่ 8  วิเคราะห์ทางเลือกผายปากเลี้ยวซ้าย</w:t>
+        <w:t>บทที่ 8  การวิเคราะห์ผลจากการผายปากและปรับรัศมีวงเลี้ยว</w:t>
       </w:r>
     </w:p>
     <w:p>
@@ -902,7 +978,7 @@
           <w:color w:val="1F3348"/>
           <w:sz w:val="32"/>
         </w:rPr>
-        <w:t>บทที่ 9  แบบสัญญาณไฟวงกลมและตารางขัดแย้ง</w:t>
+        <w:t>บทที่ 9  รูปแบบสัญญาณไฟจราจร บริเวณทางแยกหลักสี่</w:t>
       </w:r>
     </w:p>
     <w:p>
@@ -918,7 +994,7 @@
           <w:color w:val="1F3348"/>
           <w:sz w:val="32"/>
         </w:rPr>
-        <w:t>บทที่ 10  ข้อเสนอและแผนดำเนินงาน</w:t>
+        <w:t>บทที่ 10  ข้อเสนอแนะและข้อพิจารณาเพิ่มเติม</w:t>
       </w:r>
     </w:p>
     <w:p>
@@ -1033,7 +1109,7 @@
           <w:color w:val="1F3348"/>
           <w:sz w:val="32"/>
         </w:rPr>
-        <w:t>โครงการปาดผายมุมทางเลี้ยวซ้ายแยกหลักสี่ ถนนแจ้งวัฒนะตัดถนนกำแพงเพชร 6 เพื่อเพิ่มรัศมีวงเลี้ยว แก้ไขปัญหาจราจรติดขัดบริเวณถนนแจ้งวัฒนะเลี้ยวซ้ายเข้าถนนกำแพงเพชร 6 ด้านทิศเหนือ</w:t>
+        <w:t>สำนักงานเขตหลักสี่ได้มีหนังสือถึงผู้อำนวยการสำนักการจราจรและขนส่ง ขอคำนวณปริมาณจราจรบริเวณแยกหลักสี่ ถนนแจ้งวัฒนะตัดถนนกำแพงเพชร 6 เพื่อประกอบโครงการปาดผายมุมทางเลี้ยวซ้ายให้มีรัศมีวงเลี้ยวเพิ่มขึ้น แก้ไขปัญหาจราจรติดขัดที่แจ้งวัฒนะขาเข้าเลี้ยวซ้ายเข้ากำแพงเพชร 6 ทิศเหนือ</w:t>
       </w:r>
     </w:p>
     <w:p>
@@ -1049,7 +1125,7 @@
           <w:color w:val="1F3348"/>
           <w:sz w:val="32"/>
         </w:rPr>
-        <w:t>รายงานวิเคราะห์ฉบับก่อนใช้ทิศ NB เลี้ยวซ้าย และมีค่า PCU บางช่วงผิดปกติ รายงานฉบับนี้ใช้ทิศทางเป้าหมาย คือ EB5 (แจ้งวัฒนะขาเข้า เลี้ยวซ้ายเข้ากำแพงเพชร 6 ทิศเหนือ) และคำนวณใหม่จากแผ่น volume / Analysis / Queue ของไฟล์สำรวจดิบ</w:t>
+        <w:t>รายงานวิเคราะห์ฉบับก่อนใช้ทิศทาง NB เลี้ยวซ้าย และมีค่า PCU บางช่วงผิดปกติ รายงานฉบับนี้ใช้ทิศทางเป้าหมาย คือ EB5 (แจ้งวัฒนะขาเข้า เลี้ยวซ้ายเข้ากำแพงเพชร 6 ทิศเหนือ) และคำนวณใหม่จากแผ่น volume / Analysis / Queue ของไฟล์สำรวจดิบ</w:t>
       </w:r>
     </w:p>
     <w:p>
@@ -1064,7 +1140,7 @@
           <w:color w:val="1F3348"/>
           <w:sz w:val="36"/>
         </w:rPr>
-        <w:t>1.2  วัตถุประสงค์</w:t>
+        <w:t>1.2  วัตถุประสงค์การวิเคราะห์ข้อมูล</w:t>
       </w:r>
     </w:p>
     <w:p>
@@ -1080,7 +1156,7 @@
           <w:color w:val="1F3348"/>
           <w:sz w:val="32"/>
         </w:rPr>
-        <w:t>•  หาปริมาณ องค์ประกอบรถ และแถวคอยของทิศทางเป้าหมายและทั้งแยก จากข้อมูลดิบ</w:t>
+        <w:t>•  หาปริมาณจราจร องค์ประกอบรถ และแถวคอยของทิศทางเป้าหมายและทั้งแยก</w:t>
       </w:r>
     </w:p>
     <w:p>
@@ -1096,7 +1172,7 @@
           <w:color w:val="1F3348"/>
           <w:sz w:val="32"/>
         </w:rPr>
-        <w:t>•  ประเมินระดับบริการปัจจุบันของขาเลี้ยวซ้ายตาม Highway Capacity Manual</w:t>
+        <w:t>•  ประเมินระดับการให้บริการปัจจุบันของทิศทางเลี้ยวซ้ายตาม Highway Capacity Manual</w:t>
       </w:r>
     </w:p>
     <w:p>
@@ -1112,7 +1188,7 @@
           <w:color w:val="1F3348"/>
           <w:sz w:val="32"/>
         </w:rPr>
-        <w:t>•  วิเคราะห์ผลของผายปากร่วมกับช่องซ้ายผ่านตลอด เทียบสถานะที่มีสัญญาณไฟ</w:t>
+        <w:t>•  วิเคราะห์ผลจากการผายปากและเลี้ยวซ้ายผ่านตลอด เทียบสถานะสัญญาณไฟจราจร</w:t>
       </w:r>
     </w:p>
     <w:p>
@@ -1128,7 +1204,7 @@
           <w:color w:val="1F3348"/>
           <w:sz w:val="32"/>
         </w:rPr>
-        <w:t>•  กำหนดแบบหัวสัญญาณไฟวงกลมและลูกศร พร้อมตารางขัดแย้งตามทิศจริงในแผนที่</w:t>
+        <w:t>•  กำหนดแบบรอบสัญญาณไฟจราจรตามทิศทางการจราจรจริง</w:t>
       </w:r>
     </w:p>
     <w:p>
@@ -1144,7 +1220,7 @@
           <w:color w:val="1F3348"/>
           <w:sz w:val="32"/>
         </w:rPr>
-        <w:t>•  เสนอมาตรการที่ลงสนามได้ โดยเคารพเขต Protection Zone A ของรถไฟฟ้าสายสีชมพู</w:t>
+        <w:t>•  เสนอผลจากมาตรการ พร้อมข้อเสนอแนะ</w:t>
       </w:r>
     </w:p>
     <w:p>
@@ -1159,7 +1235,7 @@
           <w:color w:val="1F3348"/>
           <w:sz w:val="36"/>
         </w:rPr>
-        <w:t>1.3  ขอบเขต</w:t>
+        <w:t>1.3  ข้อจำกัดและขอบเขตการวิเคราะห์ข้อมูล</w:t>
       </w:r>
     </w:p>
     <w:p>
@@ -1175,7 +1251,7 @@
           <w:color w:val="1F3348"/>
           <w:sz w:val="32"/>
         </w:rPr>
-        <w:t>ศึกษาสี่แยกสัญญาณไฟตู้ 500 เท่านั้น ประสานกับตู้ 360 (แยกหลักสี่–วิภาวดี ห่างประมาณ 80 เมตร) ในระดับ OFFSET ไม่จำลองจุลภาคทั้งสายแจ้งวัฒนะ และไม่ประเมินอุบัติเหตุย้อนหลังเพราะไม่มีแฟ้มอุบัติเหตุประกอบการศึกษา</w:t>
+        <w:t>เป็นการศึกษาเฉพาะสัญญาณไฟจราจรหมายเลขตู้ 500 ไม่ได้วิเคราะห์ประสานกับตู้สัญญาณไฟจราจรหมายเลข 360 (แยกหลักสี่–วิภาวดี ระยะห่างประมาณ 80 เมตร) ในระดับ OFFSET ไม่มีการวิเคราะห์โครงข่ายทั้งสายถนนแจ้งวัฒนะ และไม่มีการประเมินอุบัติเหตุย้อนหลัง</w:t>
       </w:r>
     </w:p>
     <w:p>
@@ -2014,7 +2090,7 @@
                 <w:color w:val="FFFFFF"/>
                 <w:sz w:val="26"/>
               </w:rPr>
-              <w:t>เข็มทิศ</w:t>
+              <w:t>ทิศ</w:t>
             </w:r>
           </w:p>
         </w:tc>
@@ -2043,7 +2119,7 @@
                 <w:color w:val="FFFFFF"/>
                 <w:sz w:val="26"/>
               </w:rPr>
-              <w:t>ถนน / แลนด์มาร์ก</w:t>
+              <w:t>ถนน / จุดสังเกต</w:t>
             </w:r>
           </w:p>
         </w:tc>
@@ -2072,7 +2148,7 @@
                 <w:color w:val="FFFFFF"/>
                 <w:sz w:val="26"/>
               </w:rPr>
-              <w:t>ขาเข้าแยก</w:t>
+              <w:t>ทิศทาง Turning Movement</w:t>
             </w:r>
           </w:p>
         </w:tc>
@@ -2553,7 +2629,7 @@
           <w:color w:val="1F3348"/>
           <w:sz w:val="40"/>
         </w:rPr>
-        <w:t>บทที่ 3  วิธีการศึกษาและมาตรฐาน</w:t>
+        <w:t>บทที่ 3  วิธีการศึกษาและมาตรฐานตามหลักวิศวกรรมจราจร</w:t>
       </w:r>
     </w:p>
     <w:p>
@@ -2569,7 +2645,7 @@
           <w:color w:val="1F3348"/>
           <w:sz w:val="32"/>
         </w:rPr>
-        <w:t>โครงรายงานยึด ITE Recommended Practice (Transportation Impact Analyses) ปรับเป็นการศึกษาทางแยกเดี่ยว และใช้วิธีคำนวณตาม Highway Capacity Manual ฉบับที่ 7</w:t>
+        <w:t>การวิเคราะห์ตามรายงานนี้ใช้หลัก ITE Recommended Practice (Transportation Impact Analyses) ปรับเป็นการศึกษาทางแยกเดี่ยว และใช้วิธีคำนวณตาม Highway Capacity Manual ฉบับที่ 7</w:t>
       </w:r>
     </w:p>
     <w:p>
@@ -3624,7 +3700,7 @@
           <w:color w:val="1F3348"/>
           <w:sz w:val="40"/>
         </w:rPr>
-        <w:t>บทที่ 4  ผลการสำรวจปริมาณจราจร</w:t>
+        <w:t>บทที่ 4  ผลการสำรวจและวิเคราะห์ข้อมูล</w:t>
       </w:r>
     </w:p>
     <w:p>
@@ -3655,7 +3731,7 @@
           <w:color w:val="1F3348"/>
           <w:sz w:val="36"/>
         </w:rPr>
-        <w:t>4.1  สรุปทั้งแยกและทิศเป้าหมาย EB5</w:t>
+        <w:t>4.1  สรุปปริมาณจราจรทั้งแยกและทิศเป้าหมาย</w:t>
       </w:r>
     </w:p>
     <w:tbl>
@@ -4243,7 +4319,7 @@
           <w:color w:val="1F3348"/>
           <w:sz w:val="36"/>
         </w:rPr>
-        <w:t>4.2  ปริมาณรายขาเข้า 12 ชั่วโมง</w:t>
+        <w:t>4.2  ปริมาณจราจรรายขาเข้า 12 ชั่วโมง</w:t>
       </w:r>
     </w:p>
     <w:tbl>
@@ -6073,7 +6149,7 @@
           <w:color w:val="1F3348"/>
           <w:sz w:val="36"/>
         </w:rPr>
-        <w:t>4.4  องค์ประกอบรถทิศ EB5 ทั้งวัน (จากแผ่น Analysis)</w:t>
+        <w:t>4.4  สัดส่วนรถในทิศทาง EB5</w:t>
       </w:r>
     </w:p>
     <w:tbl>
@@ -6819,7 +6895,7 @@
           <w:color w:val="1F3348"/>
           <w:sz w:val="32"/>
         </w:rPr>
-        <w:t>รถยนต์และตู้รวม 99.5 % รถใหญ่ (เมล์+บรรทุก) มี 14 คันต่อ 12 ชั่วโมง — รัศมีที่กว้างขึ้นยังจำเป็นสำหรับรถเหล่านี้</w:t>
+        <w:t>รถยนต์และตู้รวม 99.5 % ข้อเสนอแนะ: รัศมีวงเลี้ยวต้องกว้างเพียงพอสำหรับรถใหญ่ที่อาจมีปริมาณ 14 คันต่อวัน</w:t>
       </w:r>
     </w:p>
     <w:p>
@@ -9536,7 +9612,7 @@
           <w:color w:val="1F3348"/>
           <w:sz w:val="40"/>
         </w:rPr>
-        <w:t>บทที่ 5  แถวคอยและระดับบริการปัจจุบัน</w:t>
+        <w:t>บทที่ 5  แถวคอยและระดับการให้บริการปัจจุบัน</w:t>
       </w:r>
     </w:p>
     <w:p>
@@ -11818,7 +11894,7 @@
           <w:color w:val="1F3348"/>
           <w:sz w:val="40"/>
         </w:rPr>
-        <w:t>บทที่ 8  วิเคราะห์ทางเลือกผายปาก</w:t>
+        <w:t>บทที่ 8  การวิเคราะห์ผลจากการผายปากและปรับรัศมีวงเลี้ยว</w:t>
       </w:r>
     </w:p>
     <w:p>
@@ -11834,7 +11910,23 @@
           <w:color w:val="1F3348"/>
           <w:sz w:val="32"/>
         </w:rPr>
-        <w:t>หลังผายปาก แยกช่องซ้ายผ่านตลอดออกจากสัญญาณ ใช้ช่องว่างวิกฤตบนกำแพงเพชร 6 ทิศเหนือ ปริมาณขัดแย้งใช้ขา NB ชั่วโมง 12:00–13:00 จากไฟล์ดิบ = 523 คัน/ชม.</w:t>
+        <w:t>การดำเนินงานโครงการคือการปาดมุมทางเท้ามุมตะวันตกเฉียงใต้ของแยก ให้รถจากถนนแจ้งวัฒนะขาเข้าเลี้ยวซ้ายเข้าถนนกำแพงเพชร 6 ทิศเหนือได้ด้วยรัศมีที่กว้างขึ้น และแยกช่องเลี้ยวซ้ายผ่านตลอดออกจากช่องทางตรง</w:t>
+      </w:r>
+    </w:p>
+    <w:p>
+      <w:pPr>
+        <w:spacing w:after="160" w:before="0" w:line="240" w:lineRule="auto"/>
+        <w:jc w:val="both"/>
+      </w:pPr>
+      <w:r>
+        <w:rPr>
+          <w:rFonts w:ascii="Calibri" w:hAnsi="Calibri" w:eastAsia="TH Sarabun New" w:cs="TH Sarabun New"/>
+          <w:b w:val="0"/>
+          <w:i w:val="0"/>
+          <w:color w:val="1F3348"/>
+          <w:sz w:val="32"/>
+        </w:rPr>
+        <w:t>หลังผายปาก แยกช่องซ้ายผ่านตลอดออกจากสัญญาณไฟจราจร ใช้ช่องว่างวิกฤตบนถนนกำแพงเพชร 6 ทิศเหนือ ปริมาณจราจรขัดแย้งใช้ขา NB ชั่วโมง 12:00–13:00 จากไฟล์ดิบ = 523 คัน/ชม.</w:t>
       </w:r>
     </w:p>
     <w:tbl>
@@ -12512,7 +12604,7 @@
           <w:color w:val="1F3348"/>
           <w:sz w:val="40"/>
         </w:rPr>
-        <w:t>บทที่ 9  แบบสัญญาณไฟวงกลมและตารางขัดแย้ง</w:t>
+        <w:t>บทที่ 9  รูปแบบสัญญาณไฟจราจร บริเวณทางแยกหลักสี่ (แยกไอทีสแควร์)</w:t>
       </w:r>
     </w:p>
     <w:p>
@@ -17374,7 +17466,7 @@
           <w:color w:val="1F3348"/>
           <w:sz w:val="40"/>
         </w:rPr>
-        <w:t>บทที่ 10  ข้อเสนอและแผนดำเนินงาน</w:t>
+        <w:t>บทที่ 10  ข้อเสนอแนะและข้อพิจารณาเพิ่มเติมด้านวิศวกรรมจราจร</w:t>
       </w:r>
     </w:p>
     <w:p>
@@ -17390,7 +17482,7 @@
           <w:color w:val="1F3348"/>
           <w:sz w:val="32"/>
         </w:rPr>
-        <w:t>เสนอทางเลือก 3: ผายปากตามแบบเขตหลักสี่ + ซ้ายผ่านตลอด EB5 + แก้หัวสัญญาณและจังหวะไฟ</w:t>
+        <w:t>จากการวิเคราะห์ปริมาณจราจร ความยาวแถวคอย และสัญญาณไฟจราจร พบว่าสมควรดำเนินการทางเลือกที่ 3 ได้แก่ การผายปากตามแบบที่เสนอ จัดช่องเลี้ยวซ้ายผ่านตลอดทิศทาง EB5 และปรับปรุงหัวสัญญาณไฟจราจรพร้อมจังหวะไฟ</w:t>
       </w:r>
     </w:p>
     <w:p>
@@ -17405,7 +17497,7 @@
           <w:color w:val="1F3348"/>
           <w:sz w:val="36"/>
         </w:rPr>
-        <w:t>10.1  สรุปผลหลัก</w:t>
+        <w:t>10.1  สรุปผลการวิเคราะห์</w:t>
       </w:r>
     </w:p>
     <w:p>
@@ -17421,7 +17513,7 @@
           <w:color w:val="1F3348"/>
           <w:sz w:val="32"/>
         </w:rPr>
-        <w:t>ปริมาณช่วงเร่งด่วน — เช้า 07:00–09:00 รวม 472 คัน เย็น 16:00–18:00 รวม 628 คัน พีคจริงของทิศนี้คือ 12:00–13:00 ที่ 342 คัน/ชม. จากแผ่น Report</w:t>
+        <w:t>ปริมาณจราจรช่วงเร่งด่วนเช้า 07:00–09:00 น. ในทิศทาง EB5 รวม 472 คัน (เฉลี่ย 236 คัน/ชม.) ช่วงเร่งด่วนเย็น 16:00–18:00 น. รวม 628 คัน ช่วงพีคของทิศทางนี้คือ 12:00–13:00 น. ที่ 342 คัน/ชม.</w:t>
       </w:r>
     </w:p>
     <w:p>
@@ -17437,7 +17529,7 @@
           <w:color w:val="1F3348"/>
           <w:sz w:val="32"/>
         </w:rPr>
-        <w:t>ใช้เส้นทางนี้ทั้งวัน — 3,330 คัน ใน 12 ชั่วโมง (3,348.5 PCU) คิดเป็น 8.2% ของรถทั้งแยก</w:t>
+        <w:t>ปริมาณจราจรที่ใช้ทิศทาง EB5 รวม 12 ชั่วโมง จำนวน 3,330 คัน (3,348.5 PCU) คิดเป็น 8.2% ของรถทั้งแยก และประมาณ 19% ของรถขาเข้าบนถนนแจ้งวัฒนะ</w:t>
       </w:r>
     </w:p>
     <w:p>
@@ -17453,7 +17545,7 @@
           <w:color w:val="1F3348"/>
           <w:sz w:val="32"/>
         </w:rPr>
-        <w:t>ผลของผายปาก — ความจุเหลือเฟือ (v/c 0.64 LOS C) หน่วงลดจาก 158 เหลือ 18 วินาที/คัน และดึง 15–20% ของขา EB ออกจากไฟ ซึ่งเป็นขาที่คิวยาวที่สุดในแผ่น Queue (200 ม.)</w:t>
+        <w:t>การผายปากและปรับเลี้ยวซ้ายผ่านตลอดสามารถดึงรถเลี้ยวซ้ายออกจากสัญญาณไฟ 15–20% ของขา EB ซึ่งเป็นขาที่ความยาวแถวคอยยาวที่สุด (สูงสุด 200 ม.) ค่า v/c ประมาณ 0.64 LOS C ลดการหน่วงจากประมาณ 158 วินาที เหลือ 18 วินาทีต่อคัน</w:t>
       </w:r>
     </w:p>
     <w:p>
@@ -17468,7 +17560,7 @@
           <w:color w:val="1F3348"/>
           <w:sz w:val="36"/>
         </w:rPr>
-        <w:t>10.2  ลำดับงาน</w:t>
+        <w:t>10.2  ข้อพิจารณาเพิ่มเติมด้านวิศวกรรมจราจร</w:t>
       </w:r>
     </w:p>
     <w:p>
@@ -17484,7 +17576,7 @@
           <w:color w:val="1F3348"/>
           <w:sz w:val="32"/>
         </w:rPr>
-        <w:t>1.  รฟม. ยืนยันเขต Protection Zone A ก่อนก่อสร้าง</w:t>
+        <w:t>1.  ช่องเร่งความเร็ว (Acceleration Lane) บนถนนกำแพงเพชร 6 ทิศเหนือ ควรกำหนดความยาวอย่างน้อย 40–60 เมตร หากเขตทางเพียงพอ</w:t>
       </w:r>
     </w:p>
     <w:p>
@@ -17500,7 +17592,7 @@
           <w:color w:val="1F3348"/>
           <w:sz w:val="32"/>
         </w:rPr>
-        <w:t>2.  สำนักการโยธาวัด swept path และช่องเร่ง NB</w:t>
+        <w:t>2.  ความยาวช่องทางเข้าและระยะปาด (Entry Lane and Taper) กำหนดในระยะ 26 เมตร สำหรับรองรับคิวรถรอให้ทางประมาณ 2–4 คัน</w:t>
       </w:r>
     </w:p>
     <w:p>
@@ -17516,7 +17608,7 @@
           <w:color w:val="1F3348"/>
           <w:sz w:val="32"/>
         </w:rPr>
-        <w:t>3.  สจส. ลงโปรแกรมตู้ตามบทที่ 9 (หัว GA ที่ B/D, ตารางขัดแย้ง, intergreen, OFFSET)</w:t>
+        <w:t>3.  ติดตั้งป้ายและเครื่องหมายจราจรเพิ่มเติม ได้แก่ เครื่องหมายเลี้ยวซ้ายผ่านตลอด ป้ายเตือนให้ทาง และเครื่องหมายห้ามจอดรถบริเวณทางแยก</w:t>
       </w:r>
     </w:p>
     <w:p>
@@ -17532,7 +17624,7 @@
           <w:color w:val="1F3348"/>
           <w:sz w:val="32"/>
         </w:rPr>
-        <w:t>4.  เปิดซ้ายผ่านตลอดพร้อมป้ายให้ทาง หลังงานโยธาและหัวสัญญาณเสร็จ</w:t>
+        <w:t>4.  ปรับเลื่อนตำแหน่งทางข้ามให้พ้นจากรัศมีทางโค้ง หรือออกแบบให้มีเกาะหลบภัย (Refuge Island)</w:t>
       </w:r>
     </w:p>
     <w:p>
@@ -17548,7 +17640,23 @@
           <w:color w:val="1F3348"/>
           <w:sz w:val="32"/>
         </w:rPr>
-        <w:t>5.  สำรวจหลังเปิด 15 นาที × 1 วันทำการ เพื่อเทียบคิว EB กับฐาน 200 ม. ในไฟล์ดิบ</w:t>
+        <w:t>5.  ตรวจสอบรัศมีวงเลี้ยว (Swept Path) ของรถบรรทุกและรถโดยสารขนาดใหญ่จำนวน 14 คันต่อ 12 ชั่วโมง จากแบบก่อสร้างมาตราส่วน 1:500</w:t>
+      </w:r>
+    </w:p>
+    <w:p>
+      <w:pPr>
+        <w:spacing w:after="80" w:before="0" w:line="240" w:lineRule="auto"/>
+        <w:jc w:val="both"/>
+      </w:pPr>
+      <w:r>
+        <w:rPr>
+          <w:rFonts w:ascii="Calibri" w:hAnsi="Calibri" w:eastAsia="TH Sarabun New" w:cs="TH Sarabun New"/>
+          <w:b w:val="0"/>
+          <w:i w:val="0"/>
+          <w:color w:val="1F3348"/>
+          <w:sz w:val="32"/>
+        </w:rPr>
+        <w:t>6.  การผายปากทางอย่างเดียวไม่เพียงพอ ควรปรับรอบจังหวะสัญญาณไฟจราจรให้สอดคล้องกับสภาพการจราจรแต่ละช่วงเวลา</w:t>
       </w:r>
     </w:p>
     <w:p>
@@ -17563,7 +17671,102 @@
           <w:color w:val="1F3348"/>
           <w:sz w:val="36"/>
         </w:rPr>
-        <w:t>10.3  รายการตรวจก่อนติดตั้งสัญญาณ</w:t>
+        <w:t>10.3  ลำดับงาน</w:t>
+      </w:r>
+    </w:p>
+    <w:p>
+      <w:pPr>
+        <w:spacing w:after="80" w:before="0" w:line="240" w:lineRule="auto"/>
+        <w:jc w:val="both"/>
+      </w:pPr>
+      <w:r>
+        <w:rPr>
+          <w:rFonts w:ascii="Calibri" w:hAnsi="Calibri" w:eastAsia="TH Sarabun New" w:cs="TH Sarabun New"/>
+          <w:b w:val="0"/>
+          <w:i w:val="0"/>
+          <w:color w:val="1F3348"/>
+          <w:sz w:val="32"/>
+        </w:rPr>
+        <w:t>1.  การรถไฟฟ้าขนส่งมวลชนแห่งประเทศไทยยืนยันเขต Protection Zone A ก่อนก่อสร้าง</w:t>
+      </w:r>
+    </w:p>
+    <w:p>
+      <w:pPr>
+        <w:spacing w:after="80" w:before="0" w:line="240" w:lineRule="auto"/>
+        <w:jc w:val="both"/>
+      </w:pPr>
+      <w:r>
+        <w:rPr>
+          <w:rFonts w:ascii="Calibri" w:hAnsi="Calibri" w:eastAsia="TH Sarabun New" w:cs="TH Sarabun New"/>
+          <w:b w:val="0"/>
+          <w:i w:val="0"/>
+          <w:color w:val="1F3348"/>
+          <w:sz w:val="32"/>
+        </w:rPr>
+        <w:t>2.  สำนักการโยธาตรวจสอบรัศมีวงเลี้ยวและช่องเร่งความเร็วทิศเหนือ</w:t>
+      </w:r>
+    </w:p>
+    <w:p>
+      <w:pPr>
+        <w:spacing w:after="80" w:before="0" w:line="240" w:lineRule="auto"/>
+        <w:jc w:val="both"/>
+      </w:pPr>
+      <w:r>
+        <w:rPr>
+          <w:rFonts w:ascii="Calibri" w:hAnsi="Calibri" w:eastAsia="TH Sarabun New" w:cs="TH Sarabun New"/>
+          <w:b w:val="0"/>
+          <w:i w:val="0"/>
+          <w:color w:val="1F3348"/>
+          <w:sz w:val="32"/>
+        </w:rPr>
+        <w:t>3.  สำนักการจราจรและขนส่งลงโปรแกรมตู้ตามบทที่ 9 (หัวลูกศรที่ B/D ตารางขัดแย้ง intergreen และ OFFSET)</w:t>
+      </w:r>
+    </w:p>
+    <w:p>
+      <w:pPr>
+        <w:spacing w:after="80" w:before="0" w:line="240" w:lineRule="auto"/>
+        <w:jc w:val="both"/>
+      </w:pPr>
+      <w:r>
+        <w:rPr>
+          <w:rFonts w:ascii="Calibri" w:hAnsi="Calibri" w:eastAsia="TH Sarabun New" w:cs="TH Sarabun New"/>
+          <w:b w:val="0"/>
+          <w:i w:val="0"/>
+          <w:color w:val="1F3348"/>
+          <w:sz w:val="32"/>
+        </w:rPr>
+        <w:t>4.  เปิดช่องเลี้ยวซ้ายผ่านตลอดพร้อมป้ายให้ทาง หลังงานโยธาและหัวสัญญาณเสร็จ</w:t>
+      </w:r>
+    </w:p>
+    <w:p>
+      <w:pPr>
+        <w:spacing w:after="80" w:before="0" w:line="240" w:lineRule="auto"/>
+        <w:jc w:val="both"/>
+      </w:pPr>
+      <w:r>
+        <w:rPr>
+          <w:rFonts w:ascii="Calibri" w:hAnsi="Calibri" w:eastAsia="TH Sarabun New" w:cs="TH Sarabun New"/>
+          <w:b w:val="0"/>
+          <w:i w:val="0"/>
+          <w:color w:val="1F3348"/>
+          <w:sz w:val="32"/>
+        </w:rPr>
+        <w:t>5.  สำรวจหลังเปิดใช้ 15 นาที × 1 วันทำการ เพื่อเทียบความยาวแถวคอยขา EB กับฐาน 200 เมตร</w:t>
+      </w:r>
+    </w:p>
+    <w:p>
+      <w:pPr>
+        <w:spacing w:before="200" w:after="120"/>
+      </w:pPr>
+      <w:r>
+        <w:rPr>
+          <w:rFonts w:ascii="Calibri" w:hAnsi="Calibri" w:eastAsia="TH Sarabun New" w:cs="TH Sarabun New"/>
+          <w:b/>
+          <w:i w:val="0"/>
+          <w:color w:val="1F3348"/>
+          <w:sz w:val="36"/>
+        </w:rPr>
+        <w:t>10.4  รายการตรวจก่อนติดตั้งสัญญาณไฟจราจร</w:t>
       </w:r>
     </w:p>
     <w:p>
@@ -17740,6 +17943,85 @@
           <w:sz w:val="32"/>
         </w:rPr>
         <w:t>11.  มองจากช่องเลี้ยวขวา EB แล้วต้องไม่เห็นวงกลมเขียวของ C ตอนสเตจ 3</w:t>
+      </w:r>
+    </w:p>
+    <w:p>
+      <w:pPr>
+        <w:spacing w:before="200" w:after="120"/>
+      </w:pPr>
+      <w:r>
+        <w:rPr>
+          <w:rFonts w:ascii="Calibri" w:hAnsi="Calibri" w:eastAsia="TH Sarabun New" w:cs="TH Sarabun New"/>
+          <w:b/>
+          <w:i w:val="0"/>
+          <w:color w:val="1F3348"/>
+          <w:sz w:val="36"/>
+        </w:rPr>
+        <w:t>ผู้วิเคราะห์ข้อมูลและจัดทำรายงาน</w:t>
+      </w:r>
+    </w:p>
+    <w:p>
+      <w:pPr>
+        <w:spacing w:after="160" w:before="0" w:line="240" w:lineRule="auto"/>
+        <w:jc w:val="both"/>
+      </w:pPr>
+      <w:r>
+        <w:rPr>
+          <w:rFonts w:ascii="Calibri" w:hAnsi="Calibri" w:eastAsia="TH Sarabun New" w:cs="TH Sarabun New"/>
+          <w:b/>
+          <w:i w:val="0"/>
+          <w:color w:val="1F3348"/>
+          <w:sz w:val="32"/>
+        </w:rPr>
+        <w:t>นางสาวประภาวดี วชิรพุทธิ์</w:t>
+      </w:r>
+    </w:p>
+    <w:p>
+      <w:pPr>
+        <w:spacing w:after="160" w:before="0" w:line="240" w:lineRule="auto"/>
+        <w:jc w:val="both"/>
+      </w:pPr>
+      <w:r>
+        <w:rPr>
+          <w:rFonts w:ascii="Calibri" w:hAnsi="Calibri" w:eastAsia="TH Sarabun New" w:cs="TH Sarabun New"/>
+          <w:b w:val="0"/>
+          <w:i w:val="0"/>
+          <w:color w:val="1F3348"/>
+          <w:sz w:val="32"/>
+        </w:rPr>
+        <w:t>นักวิชาการสถิติชำนาญการ</w:t>
+      </w:r>
+    </w:p>
+    <w:p>
+      <w:pPr>
+        <w:spacing w:after="160" w:before="0" w:line="240" w:lineRule="auto"/>
+        <w:jc w:val="both"/>
+      </w:pPr>
+      <w:r>
+        <w:rPr>
+          <w:rFonts w:ascii="Calibri" w:hAnsi="Calibri" w:eastAsia="TH Sarabun New" w:cs="TH Sarabun New"/>
+          <w:b w:val="0"/>
+          <w:i w:val="0"/>
+          <w:color w:val="1F3348"/>
+          <w:sz w:val="32"/>
+        </w:rPr>
+        <w:t>กลุ่มงานสถิติและวิจัย กองนโยบายและแผนงาน</w:t>
+      </w:r>
+    </w:p>
+    <w:p>
+      <w:pPr>
+        <w:spacing w:after="160" w:before="0" w:line="240" w:lineRule="auto"/>
+        <w:jc w:val="both"/>
+      </w:pPr>
+      <w:r>
+        <w:rPr>
+          <w:rFonts w:ascii="Calibri" w:hAnsi="Calibri" w:eastAsia="TH Sarabun New" w:cs="TH Sarabun New"/>
+          <w:b w:val="0"/>
+          <w:i w:val="0"/>
+          <w:color w:val="1F3348"/>
+          <w:sz w:val="32"/>
+        </w:rPr>
+        <w:t>สำนักการจราจรและขนส่ง กรุงเทพมหานคร</w:t>
       </w:r>
     </w:p>
     <w:p>
@@ -29332,7 +29614,7 @@
         <w:color w:val="6B6459"/>
         <w:sz w:val="24"/>
       </w:rPr>
-      <w:t>สำนักการจราจรและขนส่ง  ·  รายงานวิเคราะห์สภาพการจราจรทางแยก  ·  ตู้ 500</w:t>
+      <w:t>สำนักการจราจรและขนส่ง  ·  รายงานการวิเคราะห์ปริมาณการจราจรทางแยกหลักสี่  ·  ตู้ 500</w:t>
     </w:r>
   </w:p>
 </w:hdr>

</xml_diff>

<commit_message>
Match additional engineering notes to the attached report
Use the six official traffic-engineering considerations verbatim.
</commit_message>
<xml_diff>
--- a/public/docs/laksi-500-intersection-oa.docx
+++ b/public/docs/laksi-500-intersection-oa.docx
@@ -17576,7 +17576,7 @@
           <w:color w:val="1F3348"/>
           <w:sz w:val="32"/>
         </w:rPr>
-        <w:t>1.  ช่องเร่งความเร็ว (Acceleration Lane) บนถนนกำแพงเพชร 6 ทิศเหนือ ควรกำหนดความยาวอย่างน้อย 40–60 เมตร หากเขตทางเพียงพอ</w:t>
+        <w:t>1.  ช่องเร่งความเร็ว (Acceleration Lane) บนถนนกำแพงเพชร 6 (ทิศเหนือ) ควรกำหนดความยาวอย่างน้อย 40–60 เมตร (หากเขตทางเพียงพอ) เพื่อลดการแย่งช่องจราจรของรถเลี้ยวซ้ายผ่านตลอดกับรถทางตรงที่รอจังหวะสัญญาณไฟจราจร</w:t>
       </w:r>
     </w:p>
     <w:p>
@@ -17592,7 +17592,7 @@
           <w:color w:val="1F3348"/>
           <w:sz w:val="32"/>
         </w:rPr>
-        <w:t>2.  ความยาวช่องทางเข้าและระยะปาด (Entry Lane and Taper) กำหนดในระยะ 26 เมตร สำหรับรองรับคิวรถรอให้ทางประมาณ 2–4 คัน</w:t>
+        <w:t>2.  ความยาวช่องทางเข้าและระยะปาด (Entry Lane and Taper) กำหนดในระยะ 26 เมตร สำหรับการรองรับคิวรถรอให้ทาง (Yield) ประมาณ 2–4 คัน เนื่องจากความจุของถนนในสภาวะที่รถเคลื่อนตัวได้อิสระ (Free-flow) มีปริมาณความต้องการมากกว่า 342 คัน/ชั่วโมง</w:t>
       </w:r>
     </w:p>
     <w:p>
@@ -17608,7 +17608,7 @@
           <w:color w:val="1F3348"/>
           <w:sz w:val="32"/>
         </w:rPr>
-        <w:t>3.  ติดตั้งป้ายและเครื่องหมายจราจรเพิ่มเติม ได้แก่ เครื่องหมายเลี้ยวซ้ายผ่านตลอด ป้ายเตือนให้ทาง และเครื่องหมายห้ามจอดรถบริเวณทางแยก</w:t>
+        <w:t>3.  ติดตั้งป้ายและเครื่องหมายจราจรเพิ่มเติม อาทิ เครื่องหมายเลี้ยวซ้ายผ่านตลอด ป้ายเตือนให้ทาง (Yield Sign) และเครื่องหมายห้ามจอดรถบริเวณทางแยก</w:t>
       </w:r>
     </w:p>
     <w:p>
@@ -17624,7 +17624,7 @@
           <w:color w:val="1F3348"/>
           <w:sz w:val="32"/>
         </w:rPr>
-        <w:t>4.  ปรับเลื่อนตำแหน่งทางข้ามให้พ้นจากรัศมีทางโค้ง หรือออกแบบให้มีเกาะหลบภัย (Refuge Island)</w:t>
+        <w:t>4.  ปรับเลื่อนตำแหน่งทางข้าม (ทางม้าลาย) ให้พ้นจากรัศมีทางโค้ง หรือออกแบบให้มีเกาะหลบภัย (Refuge Island) เพื่อลดความเสี่ยงในการเกิดอุบัติเหตุจากรถเลี้ยวซ้ายผ่านตลอด</w:t>
       </w:r>
     </w:p>
     <w:p>
@@ -17640,7 +17640,7 @@
           <w:color w:val="1F3348"/>
           <w:sz w:val="32"/>
         </w:rPr>
-        <w:t>5.  ตรวจสอบรัศมีวงเลี้ยว (Swept Path) ของรถบรรทุกและรถโดยสารขนาดใหญ่จำนวน 14 คันต่อ 12 ชั่วโมง จากแบบก่อสร้างมาตราส่วน 1:500</w:t>
+        <w:t>5.  ตรวจสอบรัศมีวงเลี้ยว (Swept Path) เนื่องจากทิศทางดังกล่าวอาจมีปริมาณรถบรรทุกและรถโดยสารขนาดใหญ่จำนวน 14 คัน/12 ชั่วโมง จึงต้องตรวจสอบรัศมีวงเลี้ยวจากแบบก่อสร้าง (มาตราส่วน 1:500) ให้ถี่ถ้วนก่อนดำเนินการก่อสร้างจริง</w:t>
       </w:r>
     </w:p>
     <w:p>
@@ -17656,7 +17656,7 @@
           <w:color w:val="1F3348"/>
           <w:sz w:val="32"/>
         </w:rPr>
-        <w:t>6.  การผายปากทางอย่างเดียวไม่เพียงพอ ควรปรับรอบจังหวะสัญญาณไฟจราจรให้สอดคล้องกับสภาพการจราจรแต่ละช่วงเวลา</w:t>
+        <w:t>6.  การผายปากทางอย่างเดียวไม่เพียงพอ ควรมีการปรับรอบจังหวะสัญญาณไฟจราจรให้สอดคล้องกับสภาพการจราจรแต่ละช่วงเวลาเพิ่มเติม</w:t>
       </w:r>
     </w:p>
     <w:p>

</xml_diff>

<commit_message>
Place official considerations after the flare analysis
One six-point list matching the attached report; drop the short duplicate.
</commit_message>
<xml_diff>
--- a/public/docs/laksi-500-intersection-oa.docx
+++ b/public/docs/laksi-500-intersection-oa.docx
@@ -994,7 +994,7 @@
           <w:color w:val="1F3348"/>
           <w:sz w:val="32"/>
         </w:rPr>
-        <w:t>บทที่ 10  ข้อเสนอแนะและข้อพิจารณาเพิ่มเติม</w:t>
+        <w:t>บทที่ 10  ข้อเสนอแนะและแผนดำเนินงาน</w:t>
       </w:r>
     </w:p>
     <w:p>
@@ -12509,7 +12509,7 @@
           <w:color w:val="1F3348"/>
           <w:sz w:val="36"/>
         </w:rPr>
-        <w:t>8.1  เงื่อนไขออกแบบประกอบ</w:t>
+        <w:t>8.1  ข้อพิจารณาเพิ่มเติมด้านวิศวกรรมจราจร</w:t>
       </w:r>
     </w:p>
     <w:p>
@@ -12525,7 +12525,7 @@
           <w:color w:val="1F3348"/>
           <w:sz w:val="32"/>
         </w:rPr>
-        <w:t>•  ช่องเร่งบนกำแพงเพชร 6 ทิศเหนือ 40–60 ม. หากเขตทางพอ</w:t>
+        <w:t>1.  ช่องเร่งความเร็ว (Acceleration Lane) บนถนนกำแพงเพชร 6 (ทิศเหนือ) ควรกำหนดความยาวอย่างน้อย 40–60 เมตร (หากเขตทางเพียงพอ) เพื่อลดการแย่งช่องจราจรของรถเลี้ยวซ้ายผ่านตลอดกับรถทางตรงที่รอจังหวะสัญญาณไฟจราจร</w:t>
       </w:r>
     </w:p>
     <w:p>
@@ -12541,7 +12541,7 @@
           <w:color w:val="1F3348"/>
           <w:sz w:val="32"/>
         </w:rPr>
-        <w:t>•  ป้ายให้ทาง + ลูกศรซ้ายผ่านตลอด + ห้ามจอดปากทาง</w:t>
+        <w:t>2.  ความยาวช่องทางเข้าและระยะปาด (Entry Lane and Taper) กำหนดในระยะ 26 เมตร สำหรับการรองรับคิวรถรอให้ทาง (Yield) ประมาณ 2–4 คัน เนื่องจากความจุของถนนในสภาวะที่รถเคลื่อนตัวได้อิสระ (Free-flow) สูงกว่าปริมาณความต้องการ 342 คัน/ชั่วโมง</w:t>
       </w:r>
     </w:p>
     <w:p>
@@ -12557,7 +12557,7 @@
           <w:color w:val="1F3348"/>
           <w:sz w:val="32"/>
         </w:rPr>
-        <w:t>•  ย้ายทางม้าลายพ้นปากโค้ง หรือทำเกาะหลบภัย เพราะซ้ายอิสระตัดคนข้ามมากขึ้น</w:t>
+        <w:t>3.  ติดตั้งป้ายและเครื่องหมายจราจรเพิ่มเติม อาทิ เครื่องหมายเลี้ยวซ้ายผ่านตลอด ป้ายเตือนให้ทาง (Yield Sign) และเครื่องหมายห้ามจอดรถบริเวณทางแยก</w:t>
       </w:r>
     </w:p>
     <w:p>
@@ -12573,7 +12573,7 @@
           <w:color w:val="1F3348"/>
           <w:sz w:val="32"/>
         </w:rPr>
-        <w:t>•  ตรวจ swept path รถเมล์/บรรทุกจากแบบ 1:500 ก่อนก่อสร้าง (14 คัน/วันในทิศนี้)</w:t>
+        <w:t>4.  ปรับเลื่อนตำแหน่งทางข้าม (ทางม้าลาย) ให้พ้นจากรัศมีทางโค้ง หรือออกแบบให้มีเกาะหลบภัย (Refuge Island) เพื่อลดความเสี่ยงในการเกิดอุบัติเหตุจากรถเลี้ยวซ้ายผ่านตลอด</w:t>
       </w:r>
     </w:p>
     <w:p>
@@ -12589,7 +12589,23 @@
           <w:color w:val="1F3348"/>
           <w:sz w:val="32"/>
         </w:rPr>
-        <w:t>•  ห้ามล้ำ Protection Zone A ระยะร่น 3.00 ม. ตามแบบ</w:t>
+        <w:t>5.  ตรวจสอบรัศมีวงเลี้ยว (Swept Path) เนื่องจากทิศทางดังกล่าว อาจมีปริมาณรถบรรทุกและรถโดยสารขนาดใหญ่จำนวน 14 คัน/12 ชั่วโมง จึงต้องตรวจสอบรัศมีวงเลี้ยวจากแบบก่อสร้าง (มาตราส่วน 1:500) ให้ถี่ถ้วนก่อนดำเนินการก่อสร้างจริง</w:t>
+      </w:r>
+    </w:p>
+    <w:p>
+      <w:pPr>
+        <w:spacing w:after="80" w:before="0" w:line="240" w:lineRule="auto"/>
+        <w:jc w:val="both"/>
+      </w:pPr>
+      <w:r>
+        <w:rPr>
+          <w:rFonts w:ascii="Calibri" w:hAnsi="Calibri" w:eastAsia="TH Sarabun New" w:cs="TH Sarabun New"/>
+          <w:b w:val="0"/>
+          <w:i w:val="0"/>
+          <w:color w:val="1F3348"/>
+          <w:sz w:val="32"/>
+        </w:rPr>
+        <w:t>6.  การผายปากทางอย่างเดียวไม่เพียงพอ ควรมีการปรับรอบจังหวะสัญญาณไฟจราจรให้สอดคล้องกับสภาพการจราจรแต่ละช่วงเวลาเพิ่มเติม</w:t>
       </w:r>
     </w:p>
     <w:p>
@@ -17466,7 +17482,7 @@
           <w:color w:val="1F3348"/>
           <w:sz w:val="40"/>
         </w:rPr>
-        <w:t>บทที่ 10  ข้อเสนอแนะและข้อพิจารณาเพิ่มเติมด้านวิศวกรรมจราจร</w:t>
+        <w:t>บทที่ 10  ข้อเสนอแนะและแผนดำเนินงาน</w:t>
       </w:r>
     </w:p>
     <w:p>
@@ -17560,118 +17576,7 @@
           <w:color w:val="1F3348"/>
           <w:sz w:val="36"/>
         </w:rPr>
-        <w:t>10.2  ข้อพิจารณาเพิ่มเติมด้านวิศวกรรมจราจร</w:t>
-      </w:r>
-    </w:p>
-    <w:p>
-      <w:pPr>
-        <w:spacing w:after="80" w:before="0" w:line="240" w:lineRule="auto"/>
-        <w:jc w:val="both"/>
-      </w:pPr>
-      <w:r>
-        <w:rPr>
-          <w:rFonts w:ascii="Calibri" w:hAnsi="Calibri" w:eastAsia="TH Sarabun New" w:cs="TH Sarabun New"/>
-          <w:b w:val="0"/>
-          <w:i w:val="0"/>
-          <w:color w:val="1F3348"/>
-          <w:sz w:val="32"/>
-        </w:rPr>
-        <w:t>1.  ช่องเร่งความเร็ว (Acceleration Lane) บนถนนกำแพงเพชร 6 (ทิศเหนือ) ควรกำหนดความยาวอย่างน้อย 40–60 เมตร (หากเขตทางเพียงพอ) เพื่อลดการแย่งช่องจราจรของรถเลี้ยวซ้ายผ่านตลอดกับรถทางตรงที่รอจังหวะสัญญาณไฟจราจร</w:t>
-      </w:r>
-    </w:p>
-    <w:p>
-      <w:pPr>
-        <w:spacing w:after="80" w:before="0" w:line="240" w:lineRule="auto"/>
-        <w:jc w:val="both"/>
-      </w:pPr>
-      <w:r>
-        <w:rPr>
-          <w:rFonts w:ascii="Calibri" w:hAnsi="Calibri" w:eastAsia="TH Sarabun New" w:cs="TH Sarabun New"/>
-          <w:b w:val="0"/>
-          <w:i w:val="0"/>
-          <w:color w:val="1F3348"/>
-          <w:sz w:val="32"/>
-        </w:rPr>
-        <w:t>2.  ความยาวช่องทางเข้าและระยะปาด (Entry Lane and Taper) กำหนดในระยะ 26 เมตร สำหรับการรองรับคิวรถรอให้ทาง (Yield) ประมาณ 2–4 คัน เนื่องจากความจุของถนนในสภาวะที่รถเคลื่อนตัวได้อิสระ (Free-flow) มีปริมาณความต้องการมากกว่า 342 คัน/ชั่วโมง</w:t>
-      </w:r>
-    </w:p>
-    <w:p>
-      <w:pPr>
-        <w:spacing w:after="80" w:before="0" w:line="240" w:lineRule="auto"/>
-        <w:jc w:val="both"/>
-      </w:pPr>
-      <w:r>
-        <w:rPr>
-          <w:rFonts w:ascii="Calibri" w:hAnsi="Calibri" w:eastAsia="TH Sarabun New" w:cs="TH Sarabun New"/>
-          <w:b w:val="0"/>
-          <w:i w:val="0"/>
-          <w:color w:val="1F3348"/>
-          <w:sz w:val="32"/>
-        </w:rPr>
-        <w:t>3.  ติดตั้งป้ายและเครื่องหมายจราจรเพิ่มเติม อาทิ เครื่องหมายเลี้ยวซ้ายผ่านตลอด ป้ายเตือนให้ทาง (Yield Sign) และเครื่องหมายห้ามจอดรถบริเวณทางแยก</w:t>
-      </w:r>
-    </w:p>
-    <w:p>
-      <w:pPr>
-        <w:spacing w:after="80" w:before="0" w:line="240" w:lineRule="auto"/>
-        <w:jc w:val="both"/>
-      </w:pPr>
-      <w:r>
-        <w:rPr>
-          <w:rFonts w:ascii="Calibri" w:hAnsi="Calibri" w:eastAsia="TH Sarabun New" w:cs="TH Sarabun New"/>
-          <w:b w:val="0"/>
-          <w:i w:val="0"/>
-          <w:color w:val="1F3348"/>
-          <w:sz w:val="32"/>
-        </w:rPr>
-        <w:t>4.  ปรับเลื่อนตำแหน่งทางข้าม (ทางม้าลาย) ให้พ้นจากรัศมีทางโค้ง หรือออกแบบให้มีเกาะหลบภัย (Refuge Island) เพื่อลดความเสี่ยงในการเกิดอุบัติเหตุจากรถเลี้ยวซ้ายผ่านตลอด</w:t>
-      </w:r>
-    </w:p>
-    <w:p>
-      <w:pPr>
-        <w:spacing w:after="80" w:before="0" w:line="240" w:lineRule="auto"/>
-        <w:jc w:val="both"/>
-      </w:pPr>
-      <w:r>
-        <w:rPr>
-          <w:rFonts w:ascii="Calibri" w:hAnsi="Calibri" w:eastAsia="TH Sarabun New" w:cs="TH Sarabun New"/>
-          <w:b w:val="0"/>
-          <w:i w:val="0"/>
-          <w:color w:val="1F3348"/>
-          <w:sz w:val="32"/>
-        </w:rPr>
-        <w:t>5.  ตรวจสอบรัศมีวงเลี้ยว (Swept Path) เนื่องจากทิศทางดังกล่าวอาจมีปริมาณรถบรรทุกและรถโดยสารขนาดใหญ่จำนวน 14 คัน/12 ชั่วโมง จึงต้องตรวจสอบรัศมีวงเลี้ยวจากแบบก่อสร้าง (มาตราส่วน 1:500) ให้ถี่ถ้วนก่อนดำเนินการก่อสร้างจริง</w:t>
-      </w:r>
-    </w:p>
-    <w:p>
-      <w:pPr>
-        <w:spacing w:after="80" w:before="0" w:line="240" w:lineRule="auto"/>
-        <w:jc w:val="both"/>
-      </w:pPr>
-      <w:r>
-        <w:rPr>
-          <w:rFonts w:ascii="Calibri" w:hAnsi="Calibri" w:eastAsia="TH Sarabun New" w:cs="TH Sarabun New"/>
-          <w:b w:val="0"/>
-          <w:i w:val="0"/>
-          <w:color w:val="1F3348"/>
-          <w:sz w:val="32"/>
-        </w:rPr>
-        <w:t>6.  การผายปากทางอย่างเดียวไม่เพียงพอ ควรมีการปรับรอบจังหวะสัญญาณไฟจราจรให้สอดคล้องกับสภาพการจราจรแต่ละช่วงเวลาเพิ่มเติม</w:t>
-      </w:r>
-    </w:p>
-    <w:p>
-      <w:pPr>
-        <w:spacing w:before="200" w:after="120"/>
-      </w:pPr>
-      <w:r>
-        <w:rPr>
-          <w:rFonts w:ascii="Calibri" w:hAnsi="Calibri" w:eastAsia="TH Sarabun New" w:cs="TH Sarabun New"/>
-          <w:b/>
-          <w:i w:val="0"/>
-          <w:color w:val="1F3348"/>
-          <w:sz w:val="36"/>
-        </w:rPr>
-        <w:t>10.3  ลำดับงาน</w:t>
+        <w:t>10.2  ลำดับงาน</w:t>
       </w:r>
     </w:p>
     <w:p>
@@ -17766,7 +17671,7 @@
           <w:color w:val="1F3348"/>
           <w:sz w:val="36"/>
         </w:rPr>
-        <w:t>10.4  รายการตรวจก่อนติดตั้งสัญญาณไฟจราจร</w:t>
+        <w:t>10.3  รายการตรวจก่อนติดตั้งสัญญาณไฟจราจร</w:t>
       </w:r>
     </w:p>
     <w:p>

</xml_diff>